<commit_message>
Modularizar portal TSU: publicar auditoria curricular centralizada, auditoria de matematica y corregir navegacion en los 20 cursos
</commit_message>
<xml_diff>
--- a/Cursos/Ciberseguridad/Propuesta_Curso_Ciberseguridad_Kinal.docx
+++ b/Cursos/Ciberseguridad/Propuesta_Curso_Ciberseguridad_Kinal.docx
@@ -40,9 +40,9 @@
           <w:color w:val="003366"/>
           <w:sz w:val="40"/>
         </w:rPr>
-        <w:t>PROPUESTA FORMATIVA INSTITUCIONAL:</w:t>
+        <w:t>PLANIFICACIÓN Y PROPUESTA FORMATIVA INSTITUCIONAL:</w:t>
         <w:br/>
-        <w:t>CURSO DE FUNDAMENTOS DE CIBERSEGURIDAD Y OPERACIONES SOC</w:t>
+        <w:t>CIBERSEGURIDAD Y FUNDAMENTOS DE SEGURIDAD DE LA INFORMACIÓN</w:t>
       </w:r>
     </w:p>
     <w:p>
@@ -56,7 +56,7 @@
           <w:color w:val="4A5568"/>
           <w:sz w:val="23"/>
         </w:rPr>
-        <w:t>Capacitación Híbrida para la Reconversión Laboral y Empleabilidad Inmediata en el Ecosistema Tecnológico de Guatemala (80 Horas)</w:t>
+        <w:t>Programa de Capacitación Híbrida para la Reconversión Laboral y Empleabilidad Inmediata en el Sector Tecnológico de Guatemala (80 Horas — 20 Sesiones)</w:t>
       </w:r>
     </w:p>
     <w:tbl>
@@ -84,8 +84,8 @@
             <w:tcW w:type="dxa" w:w="4680"/>
             <w:shd w:fill="F7FAFC"/>
             <w:tcMar>
-              <w:top w:w="70" w:type="dxa"/>
-              <w:bottom w:w="70" w:type="dxa"/>
+              <w:top w:w="65" w:type="dxa"/>
+              <w:bottom w:w="65" w:type="dxa"/>
               <w:left w:w="90" w:type="dxa"/>
               <w:right w:w="90" w:type="dxa"/>
             </w:tcMar>
@@ -109,8 +109,8 @@
           <w:tcPr>
             <w:tcW w:type="dxa" w:w="4680"/>
             <w:tcMar>
-              <w:top w:w="70" w:type="dxa"/>
-              <w:bottom w:w="70" w:type="dxa"/>
+              <w:top w:w="65" w:type="dxa"/>
+              <w:bottom w:w="65" w:type="dxa"/>
               <w:left w:w="90" w:type="dxa"/>
               <w:right w:w="90" w:type="dxa"/>
             </w:tcMar>
@@ -136,8 +136,8 @@
             <w:tcW w:type="dxa" w:w="4680"/>
             <w:shd w:fill="F7FAFC"/>
             <w:tcMar>
-              <w:top w:w="70" w:type="dxa"/>
-              <w:bottom w:w="70" w:type="dxa"/>
+              <w:top w:w="65" w:type="dxa"/>
+              <w:bottom w:w="65" w:type="dxa"/>
               <w:left w:w="90" w:type="dxa"/>
               <w:right w:w="90" w:type="dxa"/>
             </w:tcMar>
@@ -161,8 +161,8 @@
           <w:tcPr>
             <w:tcW w:type="dxa" w:w="4680"/>
             <w:tcMar>
-              <w:top w:w="70" w:type="dxa"/>
-              <w:bottom w:w="70" w:type="dxa"/>
+              <w:top w:w="65" w:type="dxa"/>
+              <w:bottom w:w="65" w:type="dxa"/>
               <w:left w:w="90" w:type="dxa"/>
               <w:right w:w="90" w:type="dxa"/>
             </w:tcMar>
@@ -188,8 +188,8 @@
             <w:tcW w:type="dxa" w:w="4680"/>
             <w:shd w:fill="F7FAFC"/>
             <w:tcMar>
-              <w:top w:w="70" w:type="dxa"/>
-              <w:bottom w:w="70" w:type="dxa"/>
+              <w:top w:w="65" w:type="dxa"/>
+              <w:bottom w:w="65" w:type="dxa"/>
               <w:left w:w="90" w:type="dxa"/>
               <w:right w:w="90" w:type="dxa"/>
             </w:tcMar>
@@ -213,8 +213,8 @@
           <w:tcPr>
             <w:tcW w:type="dxa" w:w="4680"/>
             <w:tcMar>
-              <w:top w:w="70" w:type="dxa"/>
-              <w:bottom w:w="70" w:type="dxa"/>
+              <w:top w:w="65" w:type="dxa"/>
+              <w:bottom w:w="65" w:type="dxa"/>
               <w:left w:w="90" w:type="dxa"/>
               <w:right w:w="90" w:type="dxa"/>
             </w:tcMar>
@@ -229,7 +229,7 @@
                 <w:color w:val="1A202C"/>
                 <w:sz w:val="19"/>
               </w:rPr>
-              <w:t>80 horas pedagógicas totales</w:t>
+              <w:t>80 horas pedagógicas (20 sesiones de 4 horas / 240 min; 73h 20min de actividad neta)</w:t>
             </w:r>
           </w:p>
         </w:tc>
@@ -240,8 +240,8 @@
             <w:tcW w:type="dxa" w:w="4680"/>
             <w:shd w:fill="F7FAFC"/>
             <w:tcMar>
-              <w:top w:w="70" w:type="dxa"/>
-              <w:bottom w:w="70" w:type="dxa"/>
+              <w:top w:w="65" w:type="dxa"/>
+              <w:bottom w:w="65" w:type="dxa"/>
               <w:left w:w="90" w:type="dxa"/>
               <w:right w:w="90" w:type="dxa"/>
             </w:tcMar>
@@ -265,8 +265,8 @@
           <w:tcPr>
             <w:tcW w:type="dxa" w:w="4680"/>
             <w:tcMar>
-              <w:top w:w="70" w:type="dxa"/>
-              <w:bottom w:w="70" w:type="dxa"/>
+              <w:top w:w="65" w:type="dxa"/>
+              <w:bottom w:w="65" w:type="dxa"/>
               <w:left w:w="90" w:type="dxa"/>
               <w:right w:w="90" w:type="dxa"/>
             </w:tcMar>
@@ -281,7 +281,7 @@
                 <w:color w:val="1A202C"/>
                 <w:sz w:val="19"/>
               </w:rPr>
-              <w:t>80% Virtual (64 horas sincrónicas/laboratorios) / 20% Presencial (16 horas prácticas en Kinal)</w:t>
+              <w:t>80% Virtual (16 sesiones / 64 horas) y 20% Presencial (4 sesiones / 16 horas en Kinal)</w:t>
             </w:r>
           </w:p>
         </w:tc>
@@ -292,8 +292,8 @@
             <w:tcW w:type="dxa" w:w="4680"/>
             <w:shd w:fill="F7FAFC"/>
             <w:tcMar>
-              <w:top w:w="70" w:type="dxa"/>
-              <w:bottom w:w="70" w:type="dxa"/>
+              <w:top w:w="65" w:type="dxa"/>
+              <w:bottom w:w="65" w:type="dxa"/>
               <w:left w:w="90" w:type="dxa"/>
               <w:right w:w="90" w:type="dxa"/>
             </w:tcMar>
@@ -317,8 +317,8 @@
           <w:tcPr>
             <w:tcW w:type="dxa" w:w="4680"/>
             <w:tcMar>
-              <w:top w:w="70" w:type="dxa"/>
-              <w:bottom w:w="70" w:type="dxa"/>
+              <w:top w:w="65" w:type="dxa"/>
+              <w:bottom w:w="65" w:type="dxa"/>
               <w:left w:w="90" w:type="dxa"/>
               <w:right w:w="90" w:type="dxa"/>
             </w:tcMar>
@@ -333,7 +333,7 @@
                 <w:color w:val="1A202C"/>
                 <w:sz w:val="19"/>
               </w:rPr>
-              <w:t>Por convenir (Sesiones virtuales de 3 horas, 2 días entre semana; sesiones presenciales de 8 horas los sábados). Sin fechas fijas.</w:t>
+              <w:t>Por convenir institucionalmente (secuencia por sesiones, sin imponer días u horas fijas)</w:t>
             </w:r>
           </w:p>
         </w:tc>
@@ -344,8 +344,8 @@
             <w:tcW w:type="dxa" w:w="4680"/>
             <w:shd w:fill="F7FAFC"/>
             <w:tcMar>
-              <w:top w:w="70" w:type="dxa"/>
-              <w:bottom w:w="70" w:type="dxa"/>
+              <w:top w:w="65" w:type="dxa"/>
+              <w:bottom w:w="65" w:type="dxa"/>
               <w:left w:w="90" w:type="dxa"/>
               <w:right w:w="90" w:type="dxa"/>
             </w:tcMar>
@@ -361,7 +361,7 @@
                 <w:color w:val="003366"/>
                 <w:sz w:val="19"/>
               </w:rPr>
-              <w:t>Enfoque Laboral Central:</w:t>
+              <w:t>Orientación de Empleabilidad:</w:t>
             </w:r>
           </w:p>
         </w:tc>
@@ -369,8 +369,8 @@
           <w:tcPr>
             <w:tcW w:type="dxa" w:w="4680"/>
             <w:tcMar>
-              <w:top w:w="70" w:type="dxa"/>
-              <w:bottom w:w="70" w:type="dxa"/>
+              <w:top w:w="65" w:type="dxa"/>
+              <w:bottom w:w="65" w:type="dxa"/>
               <w:left w:w="90" w:type="dxa"/>
               <w:right w:w="90" w:type="dxa"/>
             </w:tcMar>
@@ -385,7 +385,7 @@
                 <w:color w:val="1A202C"/>
                 <w:sz w:val="19"/>
               </w:rPr>
-              <w:t>Inserción laboral inmediata como Analista SOC Junior / Técnico de Soporte en Ciberseguridad</w:t>
+              <w:t>Soporte técnico, operación tecnológica y funciones iniciales de apoyo a seguridad</w:t>
             </w:r>
           </w:p>
         </w:tc>
@@ -396,8 +396,8 @@
             <w:tcW w:type="dxa" w:w="4680"/>
             <w:shd w:fill="F7FAFC"/>
             <w:tcMar>
-              <w:top w:w="70" w:type="dxa"/>
-              <w:bottom w:w="70" w:type="dxa"/>
+              <w:top w:w="65" w:type="dxa"/>
+              <w:bottom w:w="65" w:type="dxa"/>
               <w:left w:w="90" w:type="dxa"/>
               <w:right w:w="90" w:type="dxa"/>
             </w:tcMar>
@@ -421,8 +421,8 @@
           <w:tcPr>
             <w:tcW w:type="dxa" w:w="4680"/>
             <w:tcMar>
-              <w:top w:w="70" w:type="dxa"/>
-              <w:bottom w:w="70" w:type="dxa"/>
+              <w:top w:w="65" w:type="dxa"/>
+              <w:bottom w:w="65" w:type="dxa"/>
               <w:left w:w="90" w:type="dxa"/>
               <w:right w:w="90" w:type="dxa"/>
             </w:tcMar>
@@ -437,7 +437,7 @@
                 <w:color w:val="1A202C"/>
                 <w:sz w:val="19"/>
               </w:rPr>
-              <w:t>75 puntos sobre 100 en todas las evaluaciones de taller, proyectos y examen terminal</w:t>
+              <w:t>75 puntos sobre 100 en todas las comprobaciones, productos y proyecto integrador</w:t>
             </w:r>
           </w:p>
         </w:tc>
@@ -448,8 +448,8 @@
             <w:tcW w:type="dxa" w:w="4680"/>
             <w:shd w:fill="F7FAFC"/>
             <w:tcMar>
-              <w:top w:w="70" w:type="dxa"/>
-              <w:bottom w:w="70" w:type="dxa"/>
+              <w:top w:w="65" w:type="dxa"/>
+              <w:bottom w:w="65" w:type="dxa"/>
               <w:left w:w="90" w:type="dxa"/>
               <w:right w:w="90" w:type="dxa"/>
             </w:tcMar>
@@ -473,8 +473,8 @@
           <w:tcPr>
             <w:tcW w:type="dxa" w:w="4680"/>
             <w:tcMar>
-              <w:top w:w="70" w:type="dxa"/>
-              <w:bottom w:w="70" w:type="dxa"/>
+              <w:top w:w="65" w:type="dxa"/>
+              <w:bottom w:w="65" w:type="dxa"/>
               <w:left w:w="90" w:type="dxa"/>
               <w:right w:w="90" w:type="dxa"/>
             </w:tcMar>
@@ -489,7 +489,7 @@
                 <w:color w:val="1A202C"/>
                 <w:sz w:val="19"/>
               </w:rPr>
-              <w:t>Fundación Kinal — Laboratorios de Redes y Cómputo, Sede Central, Zona 7, Ciudad de Guatemala</w:t>
+              <w:t>Fundación Kinal — Laboratorios de Cómputo y Redes, Sede Central, Zona 7, Ciudad de Guatemala</w:t>
             </w:r>
           </w:p>
         </w:tc>
@@ -525,7 +525,7 @@
           <w:color w:val="1A202C"/>
           <w:sz w:val="21"/>
         </w:rPr>
-        <w:t>En el campo de la ciberseguridad, la solvencia técnica es inseparable de la rectitud moral y la confiabilidad personal. La capacitación en defensa de infraestructuras informáticas exige de los estudiantes una adhesión irrestricta a los principios que sustentan a Fundación Kinal:</w:t>
+        <w:t>El diseño formativo se cimenta en la visión humanística y ética de Fundación Kinal, garantizando que el aprendizaje técnico esté indisolublemente ligado a la responsabilidad personal, la honradez y el servicio a la comunidad:</w:t>
       </w:r>
     </w:p>
     <w:tbl>
@@ -544,10 +544,10 @@
             <w:tcW w:type="dxa" w:w="9360"/>
             <w:shd w:fill="F7FAFC"/>
             <w:tcMar>
-              <w:top w:w="130" w:type="dxa"/>
-              <w:bottom w:w="130" w:type="dxa"/>
+              <w:top w:w="120" w:type="dxa"/>
+              <w:bottom w:w="120" w:type="dxa"/>
               <w:left w:w="180" w:type="dxa"/>
-              <w:right w:w="130" w:type="dxa"/>
+              <w:right w:w="120" w:type="dxa"/>
             </w:tcMar>
             <w:tcBorders>
               <w:left w:val="single" w:sz="24" w:space="0" w:color="003366"/>
@@ -584,7 +584,7 @@
     </w:tbl>
     <w:p>
       <w:pPr>
-        <w:spacing w:before="0" w:after="120"/>
+        <w:spacing w:before="0" w:after="120" w:line="276" w:lineRule="auto"/>
       </w:pPr>
     </w:p>
     <w:tbl>
@@ -603,10 +603,10 @@
             <w:tcW w:type="dxa" w:w="9360"/>
             <w:shd w:fill="F7FAFC"/>
             <w:tcMar>
-              <w:top w:w="130" w:type="dxa"/>
-              <w:bottom w:w="130" w:type="dxa"/>
+              <w:top w:w="120" w:type="dxa"/>
+              <w:bottom w:w="120" w:type="dxa"/>
               <w:left w:w="180" w:type="dxa"/>
-              <w:right w:w="130" w:type="dxa"/>
+              <w:right w:w="120" w:type="dxa"/>
             </w:tcMar>
             <w:tcBorders>
               <w:left w:val="single" w:sz="24" w:space="0" w:color="003366"/>
@@ -643,7 +643,7 @@
     </w:tbl>
     <w:p>
       <w:pPr>
-        <w:spacing w:before="0" w:after="120"/>
+        <w:spacing w:before="0" w:after="120" w:line="276" w:lineRule="auto"/>
       </w:pPr>
     </w:p>
     <w:p>
@@ -658,7 +658,7 @@
           <w:color w:val="003366"/>
           <w:sz w:val="26"/>
         </w:rPr>
-        <w:t>1.1 El Principio del «Trabajo Bien Hecho» y la Ética Profesional en Ciberdefensa</w:t>
+        <w:t>1.1 El Principio del «Trabajo Bien Hecho» Aplicado a la Seguridad de la Información</w:t>
       </w:r>
     </w:p>
     <w:p>
@@ -671,13 +671,13 @@
           <w:color w:val="1A202C"/>
           <w:sz w:val="20"/>
         </w:rPr>
-        <w:t>El «trabajo bien hecho» en la seguridad de la información se traduce en disciplina técnica, minuciosidad y sigilo profesional:</w:t>
+        <w:t>En este programa, el principio rector del «trabajo bien hecho» se manifiesta en estándares profesionales innegociables:</w:t>
         <w:br/>
-        <w:t>• Cero negligencia en configuraciones: Cada directiva de seguridad, regla de firewall o parámetro de autenticación debe aplicarse con precisión exhaustiva, evitando configuraciones por defecto o 'atajos' inseguros.</w:t>
+        <w:t>• Rigor en la asignación de controles: Un control no es una declaración abstracta; debe contener alcance explícito, responsable asignado, procedimiento de ejecución y evidencia verificable de cumplimiento.</w:t>
         <w:br/>
-        <w:t>• Documentación rigurosa de incidentes: El analista debe levantar reportes claros, fidedignos y con evidencia verificable (hashes SHA-256, marcas temporales UTC, capturas de tráfico intactas) preservando la cadena de custodia.</w:t>
+        <w:t>• Trazabilidad y verdad en los registros: Separar hechos comprobables de meras hipótesis técnicas al analizar eventos en SIEM o servidores, preservando la exactitud de fechas, actores y resultados sin alterar evidencias.</w:t>
         <w:br/>
-        <w:t>• Acuerdo de Confidencialidad y Uso Ético (NDA Didáctico): Cada participante suscribe al inicio del curso un compromiso formal de no utilizar las herramientas de análisis de vulnerabilidades fuera de los entornos controlados de laboratorio, entendiendo que el conocimiento técnico está puesto al servicio del bien común y la protección de la sociedad.</w:t>
+        <w:t>• Confidencialidad y protección cotidiana de datos: Cero tolerancia a compartir credenciales o anotarlas en lugares visibles; uso estricto de cuentas individuales y canales aprobados desde la primera sesión.</w:t>
       </w:r>
     </w:p>
     <w:p>
@@ -692,7 +692,7 @@
           <w:color w:val="003366"/>
           <w:sz w:val="30"/>
         </w:rPr>
-        <w:t>2. Demanda del Mercado Laboral Guatemalteco y Empleabilidad Inmediata</w:t>
+        <w:t>2. Fundamentación Técnica, Enfoque Pedagógico y Caso Transversal</w:t>
       </w:r>
     </w:p>
     <w:p>
@@ -705,15 +705,13 @@
           <w:color w:val="1A202C"/>
           <w:sz w:val="20"/>
         </w:rPr>
-        <w:t>Una investigación reciente sobre las ofertas de empleo en Guatemala revela una escasez aguda de perfiles operativos en ciberseguridad. Las empresas demandan cada vez más personal junior capaz de incorporarse de inmediato a turnos de monitoreo y soporte técnico de seguridad:</w:t>
+        <w:t>A diferencia de propuestas puramente teóricas o cursos desarticulados de herramientas ofensivas, este programa adopta un enfoque constructivo orientado a la realidad laboral de las organizaciones en Guatemala:</w:t>
         <w:br/>
-        <w:t>• Sectores Contratantes en Guatemala: El sistema bancario y financiero nacional (Banco Industrial, Banrural, BAC Credomatic, BAM, G&amp;T Continental), las empresas de telecomunicaciones (Tigo, Claro), firmas de servicios administrados de seguridad SOC (Devel Security, Cyberseg, S-Cube), cadenas de retail y empresas de BPO con servicios tecnológicos hacia Estados Unidos y Latinoamérica.</w:t>
+        <w:t>• Caso Práctico Transversal de Empresa Ficticia: Cada sesión conecta un concepto técnico con una situación laboral concreta a través de una empresa ficticia que cuenta con estaciones de trabajo, red local, un servidor corporativo, una aplicación web y servicios SaaS. El mismo caso se amplía progresivamente durante los 8 módulos, evitando ejercicios aislados o controles descontextualizados.</w:t>
         <w:br/>
-        <w:t>• Puesto de Entrada Más Demandado: Analista de Centro de Operaciones de Seguridad (Analista SOC Nivel 1) y Técnico de Soporte en Ciberseguridad y Hardening.</w:t>
+        <w:t>• Enfoque de Análisis y Verificación (No Explotativo): Las actividades prácticas se centran en leer, comparar, representar, justificar y documentar. Las demostraciones se ejecutan sobre escenarios autorizados y datos simulados, sin exigir explotación de vulnerabilidades ni ataques intrusivos.</w:t>
         <w:br/>
-        <w:t>• Nivel Salarial Promedio: Las vacantes de entrada para técnicos con destrezas prácticas comprobadas oscilan entre Q6,000.00 y Q9,000.00 mensuales, ofreciendo una vía concreta y rápida de superación socioeconómica para personas actualmente desempleadas.</w:t>
-        <w:br/>
-        <w:t>• Competencias de Empleabilidad Priorizadas: Triaje rápido de alertas en plataformas SIEM, lectura e interpretación de logs en Windows/Linux, filtrado de tráfico en firewalls, análisis de correos phishing y aplicación de medidas de contención inmediata.</w:t>
+        <w:t>• Delimitación Profesional del Alcance: El curso forma el criterio técnico para interpretar sistemas, dialogar con proveedores, diseñar salvaguardas y escalar incidentes; no acredita especialización en pentesting, auditoría avanzada ni ingeniería de redes.</w:t>
       </w:r>
     </w:p>
     <w:p>
@@ -728,7 +726,7 @@
           <w:color w:val="003366"/>
           <w:sz w:val="30"/>
         </w:rPr>
-        <w:t>3. Marco Alemán de Cualificaciones (DQR Nivel 4-5) y Metodología Dual</w:t>
+        <w:t>3. Marco Alemán de Cualificaciones (DQR Nivel 4-5) y Enfoque Dual</w:t>
       </w:r>
     </w:p>
     <w:tbl>
@@ -747,10 +745,10 @@
             <w:tcW w:type="dxa" w:w="9360"/>
             <w:shd w:fill="F7FAFC"/>
             <w:tcMar>
-              <w:top w:w="130" w:type="dxa"/>
-              <w:bottom w:w="130" w:type="dxa"/>
+              <w:top w:w="120" w:type="dxa"/>
+              <w:bottom w:w="120" w:type="dxa"/>
               <w:left w:w="180" w:type="dxa"/>
-              <w:right w:w="130" w:type="dxa"/>
+              <w:right w:w="120" w:type="dxa"/>
             </w:tcMar>
             <w:tcBorders>
               <w:left w:val="single" w:sz="24" w:space="0" w:color="003366"/>
@@ -787,7 +785,7 @@
     </w:tbl>
     <w:p>
       <w:pPr>
-        <w:spacing w:before="0" w:after="120"/>
+        <w:spacing w:before="0" w:after="120" w:line="276" w:lineRule="auto"/>
       </w:pPr>
     </w:p>
     <w:tbl>
@@ -806,10 +804,10 @@
             <w:tcW w:type="dxa" w:w="9360"/>
             <w:shd w:fill="F7FAFC"/>
             <w:tcMar>
-              <w:top w:w="130" w:type="dxa"/>
-              <w:bottom w:w="130" w:type="dxa"/>
+              <w:top w:w="120" w:type="dxa"/>
+              <w:bottom w:w="120" w:type="dxa"/>
               <w:left w:w="180" w:type="dxa"/>
-              <w:right w:w="130" w:type="dxa"/>
+              <w:right w:w="120" w:type="dxa"/>
             </w:tcMar>
             <w:tcBorders>
               <w:left w:val="single" w:sz="24" w:space="0" w:color="003366"/>
@@ -846,7 +844,7 @@
     </w:tbl>
     <w:p>
       <w:pPr>
-        <w:spacing w:before="0" w:after="120"/>
+        <w:spacing w:before="0" w:after="120" w:line="276" w:lineRule="auto"/>
       </w:pPr>
     </w:p>
     <w:tbl>
@@ -926,7 +924,7 @@
                 <w:color w:val="FFFFFF"/>
                 <w:sz w:val="19"/>
               </w:rPr>
-              <w:t>Evidencia Operativa en el Curso</w:t>
+              <w:t>Evidencia de Desempeño en el Programa</w:t>
             </w:r>
           </w:p>
         </w:tc>
@@ -937,10 +935,10 @@
             <w:tcW w:type="dxa" w:w="3120"/>
             <w:shd w:fill="F7FAFC"/>
             <w:tcMar>
-              <w:top w:w="70" w:type="dxa"/>
-              <w:bottom w:w="70" w:type="dxa"/>
-              <w:left w:w="80" w:type="dxa"/>
-              <w:right w:w="80" w:type="dxa"/>
+              <w:top w:w="65" w:type="dxa"/>
+              <w:bottom w:w="65" w:type="dxa"/>
+              <w:left w:w="75" w:type="dxa"/>
+              <w:right w:w="75" w:type="dxa"/>
             </w:tcMar>
           </w:tcPr>
           <w:p>
@@ -964,10 +962,10 @@
             <w:tcW w:type="dxa" w:w="3120"/>
             <w:shd w:fill="F7FAFC"/>
             <w:tcMar>
-              <w:top w:w="70" w:type="dxa"/>
-              <w:bottom w:w="70" w:type="dxa"/>
-              <w:left w:w="80" w:type="dxa"/>
-              <w:right w:w="80" w:type="dxa"/>
+              <w:top w:w="65" w:type="dxa"/>
+              <w:bottom w:w="65" w:type="dxa"/>
+              <w:left w:w="75" w:type="dxa"/>
+              <w:right w:w="75" w:type="dxa"/>
             </w:tcMar>
           </w:tcPr>
           <w:p>
@@ -991,10 +989,10 @@
             <w:tcW w:type="dxa" w:w="3120"/>
             <w:shd w:fill="F7FAFC"/>
             <w:tcMar>
-              <w:top w:w="70" w:type="dxa"/>
-              <w:bottom w:w="70" w:type="dxa"/>
-              <w:left w:w="80" w:type="dxa"/>
-              <w:right w:w="80" w:type="dxa"/>
+              <w:top w:w="65" w:type="dxa"/>
+              <w:bottom w:w="65" w:type="dxa"/>
+              <w:left w:w="75" w:type="dxa"/>
+              <w:right w:w="75" w:type="dxa"/>
             </w:tcMar>
           </w:tcPr>
           <w:p>
@@ -1007,7 +1005,7 @@
                 <w:color w:val="1A202C"/>
                 <w:sz w:val="18"/>
               </w:rPr>
-              <w:t>Arquitectura de protocolos TCP/IP, modelos de defensa perimetral, funcionamiento de malware, directivas GPO/Linux y marcos de respuesta NIST SP 800-61.</w:t>
+              <w:t>Arquitectura de sistemas/nube, protocolos web (HTTP/TLS), marcos de autenticación (SAML/OAuth), ciclo de vulnerabilidades (CVE/CVSS) y estándares normativos (ISO 27001, PCI DSS, SOC, HIPAA).</w:t>
             </w:r>
           </w:p>
         </w:tc>
@@ -1017,10 +1015,10 @@
           <w:tcPr>
             <w:tcW w:type="dxa" w:w="3120"/>
             <w:tcMar>
-              <w:top w:w="70" w:type="dxa"/>
-              <w:bottom w:w="70" w:type="dxa"/>
-              <w:left w:w="80" w:type="dxa"/>
-              <w:right w:w="80" w:type="dxa"/>
+              <w:top w:w="65" w:type="dxa"/>
+              <w:bottom w:w="65" w:type="dxa"/>
+              <w:left w:w="75" w:type="dxa"/>
+              <w:right w:w="75" w:type="dxa"/>
             </w:tcMar>
           </w:tcPr>
           <w:p>
@@ -1043,10 +1041,10 @@
           <w:tcPr>
             <w:tcW w:type="dxa" w:w="3120"/>
             <w:tcMar>
-              <w:top w:w="70" w:type="dxa"/>
-              <w:bottom w:w="70" w:type="dxa"/>
-              <w:left w:w="80" w:type="dxa"/>
-              <w:right w:w="80" w:type="dxa"/>
+              <w:top w:w="65" w:type="dxa"/>
+              <w:bottom w:w="65" w:type="dxa"/>
+              <w:left w:w="75" w:type="dxa"/>
+              <w:right w:w="75" w:type="dxa"/>
             </w:tcMar>
           </w:tcPr>
           <w:p>
@@ -1069,10 +1067,10 @@
           <w:tcPr>
             <w:tcW w:type="dxa" w:w="3120"/>
             <w:tcMar>
-              <w:top w:w="70" w:type="dxa"/>
-              <w:bottom w:w="70" w:type="dxa"/>
-              <w:left w:w="80" w:type="dxa"/>
-              <w:right w:w="80" w:type="dxa"/>
+              <w:top w:w="65" w:type="dxa"/>
+              <w:bottom w:w="65" w:type="dxa"/>
+              <w:left w:w="75" w:type="dxa"/>
+              <w:right w:w="75" w:type="dxa"/>
             </w:tcMar>
           </w:tcPr>
           <w:p>
@@ -1085,7 +1083,7 @@
                 <w:color w:val="1A202C"/>
                 <w:sz w:val="18"/>
               </w:rPr>
-              <w:t>Configuración de firewalls, inspección de paquetes en Wireshark, correlación de logs en Wazuh SIEM, bastionado de servidores y análisis de correos phishing.</w:t>
+              <w:t>Diagramación de flujos de sistemas, construcción de matrices RBAC, diseño de controles verificables, correlación de logs en SIEM, lectura de avisos de seguridad y redacción de SOPs.</w:t>
             </w:r>
           </w:p>
         </w:tc>
@@ -1096,10 +1094,10 @@
             <w:tcW w:type="dxa" w:w="3120"/>
             <w:shd w:fill="F7FAFC"/>
             <w:tcMar>
-              <w:top w:w="70" w:type="dxa"/>
-              <w:bottom w:w="70" w:type="dxa"/>
-              <w:left w:w="80" w:type="dxa"/>
-              <w:right w:w="80" w:type="dxa"/>
+              <w:top w:w="65" w:type="dxa"/>
+              <w:bottom w:w="65" w:type="dxa"/>
+              <w:left w:w="75" w:type="dxa"/>
+              <w:right w:w="75" w:type="dxa"/>
             </w:tcMar>
           </w:tcPr>
           <w:p>
@@ -1123,10 +1121,10 @@
             <w:tcW w:type="dxa" w:w="3120"/>
             <w:shd w:fill="F7FAFC"/>
             <w:tcMar>
-              <w:top w:w="70" w:type="dxa"/>
-              <w:bottom w:w="70" w:type="dxa"/>
-              <w:left w:w="80" w:type="dxa"/>
-              <w:right w:w="80" w:type="dxa"/>
+              <w:top w:w="65" w:type="dxa"/>
+              <w:bottom w:w="65" w:type="dxa"/>
+              <w:left w:w="75" w:type="dxa"/>
+              <w:right w:w="75" w:type="dxa"/>
             </w:tcMar>
           </w:tcPr>
           <w:p>
@@ -1150,10 +1148,10 @@
             <w:tcW w:type="dxa" w:w="3120"/>
             <w:shd w:fill="F7FAFC"/>
             <w:tcMar>
-              <w:top w:w="70" w:type="dxa"/>
-              <w:bottom w:w="70" w:type="dxa"/>
-              <w:left w:w="80" w:type="dxa"/>
-              <w:right w:w="80" w:type="dxa"/>
+              <w:top w:w="65" w:type="dxa"/>
+              <w:bottom w:w="65" w:type="dxa"/>
+              <w:left w:w="75" w:type="dxa"/>
+              <w:right w:w="75" w:type="dxa"/>
             </w:tcMar>
           </w:tcPr>
           <w:p>
@@ -1166,7 +1164,7 @@
                 <w:color w:val="1A202C"/>
                 <w:sz w:val="18"/>
               </w:rPr>
-              <w:t>Comunicación técnica serena y clara durante incidentes críticos, trabajo coordinado en células Blue Team y elaboración de informes para gerencia.</w:t>
+              <w:t>Capacidad de comunicación asertiva entre el área técnica y las áreas usuarias, fundamentación de decisiones ante comités de cambio y reporte oportuno y sereno de incidentes.</w:t>
             </w:r>
           </w:p>
         </w:tc>
@@ -1176,10 +1174,10 @@
           <w:tcPr>
             <w:tcW w:type="dxa" w:w="3120"/>
             <w:tcMar>
-              <w:top w:w="70" w:type="dxa"/>
-              <w:bottom w:w="70" w:type="dxa"/>
-              <w:left w:w="80" w:type="dxa"/>
-              <w:right w:w="80" w:type="dxa"/>
+              <w:top w:w="65" w:type="dxa"/>
+              <w:bottom w:w="65" w:type="dxa"/>
+              <w:left w:w="75" w:type="dxa"/>
+              <w:right w:w="75" w:type="dxa"/>
             </w:tcMar>
           </w:tcPr>
           <w:p>
@@ -1202,10 +1200,10 @@
           <w:tcPr>
             <w:tcW w:type="dxa" w:w="3120"/>
             <w:tcMar>
-              <w:top w:w="70" w:type="dxa"/>
-              <w:bottom w:w="70" w:type="dxa"/>
-              <w:left w:w="80" w:type="dxa"/>
-              <w:right w:w="80" w:type="dxa"/>
+              <w:top w:w="65" w:type="dxa"/>
+              <w:bottom w:w="65" w:type="dxa"/>
+              <w:left w:w="75" w:type="dxa"/>
+              <w:right w:w="75" w:type="dxa"/>
             </w:tcMar>
           </w:tcPr>
           <w:p>
@@ -1228,10 +1226,10 @@
           <w:tcPr>
             <w:tcW w:type="dxa" w:w="3120"/>
             <w:tcMar>
-              <w:top w:w="70" w:type="dxa"/>
-              <w:bottom w:w="70" w:type="dxa"/>
-              <w:left w:w="80" w:type="dxa"/>
-              <w:right w:w="80" w:type="dxa"/>
+              <w:top w:w="65" w:type="dxa"/>
+              <w:bottom w:w="65" w:type="dxa"/>
+              <w:left w:w="75" w:type="dxa"/>
+              <w:right w:w="75" w:type="dxa"/>
             </w:tcMar>
           </w:tcPr>
           <w:p>
@@ -1244,7 +1242,7 @@
                 <w:color w:val="1A202C"/>
                 <w:sz w:val="18"/>
               </w:rPr>
-              <w:t>Criterio analítico para distinguir falsos positivos de intrusiones reales, apego ético incondicional y autoexigencia bajo el principio del 'trabajo bien hecho'.</w:t>
+              <w:t>Criterio técnico independiente para evaluar riesgos, responsabilidad en la custodia de accesos, autoinspección de calidad técnica y adhesión inquebrantable a la ética digital.</w:t>
             </w:r>
           </w:p>
         </w:tc>
@@ -1295,7 +1293,7 @@
           <w:color w:val="1A202C"/>
           <w:sz w:val="21"/>
         </w:rPr>
-        <w:t>Dirigido a jóvenes y adultos desempleados de 18 a 45 años con conocimientos previos en informática, administración básica de sistemas o redes, motivados a reconvertirse laboralmente hacia la ciberdefensa con compromiso ético y disciplina.</w:t>
+        <w:t>Dirigido a personas de 18 a 45 años desempleadas con conocimientos previos de informática que buscan fortalecer su preparación para funciones iniciales de soporte, operación tecnológica y apoyo a seguridad de la información. Se requiere manejo básico de computadora, navegador, archivos y documentos; no se requiere programación ni administración avanzada de redes.</w:t>
       </w:r>
     </w:p>
     <w:p>
@@ -1323,7 +1321,7 @@
           <w:color w:val="1A202C"/>
           <w:sz w:val="21"/>
         </w:rPr>
-        <w:t>El egresado opera como Analista SOC Junior o Técnico de Ciberseguridad, capaz de monitorear telemetría, realizar triaje de alertas de seguridad, aplicar hardening en Windows y Linux, analizar amenazas de malware o phishing y ejecutar contención básica de incidentes.</w:t>
+        <w:t>El egresado interpreta sistemas, redes y servicios digitales delimitando fronteras y riesgos; diseña controles de identidad y acceso bajo mínimo privilegio; analiza la protección del transporte web; correlaciona eventos en SIEM; gestiona el ciclo de vida de vulnerabilidades; redacta políticas y SOPs ejecutables; y reporta señales de incidentes bajo las mejores prácticas de la industria y los valores de Kinal.</w:t>
       </w:r>
     </w:p>
     <w:p>
@@ -1338,7 +1336,7 @@
           <w:color w:val="003366"/>
           <w:sz w:val="30"/>
         </w:rPr>
-        <w:t>5. Arquitectura Curricular y Modalidad Híbrida (80 Horas)</w:t>
+        <w:t>5. Arquitectura Curricular y Distribución Modular (80 Horas — 20 Sesiones)</w:t>
       </w:r>
     </w:p>
     <w:p>
@@ -1351,7 +1349,7 @@
           <w:color w:val="1A202C"/>
           <w:sz w:val="20"/>
         </w:rPr>
-        <w:t>El programa distribuye sus 80 horas en un 80% virtual (64 horas de clases sincrónicas y laboratorios guiados) y un 20% presencial (16 horas de talleres intensivos en 2 sábados de 8 horas en Kinal):</w:t>
+        <w:t>Las 80 horas corresponden a 20 encuentros de 240 minutos (con 20 minutos de receso por encuentro, sumando 73h 20min de actividad formativa efectiva). El programa se distribuye en 8 módulos especializados:</w:t>
       </w:r>
     </w:p>
     <w:tbl>
@@ -1370,11 +1368,11 @@
         </w:tblBorders>
       </w:tblPr>
       <w:tblGrid>
-        <w:gridCol w:w="1584"/>
-        <w:gridCol w:w="2592"/>
-        <w:gridCol w:w="1728"/>
-        <w:gridCol w:w="2592"/>
+        <w:gridCol w:w="1296"/>
+        <w:gridCol w:w="3168"/>
         <w:gridCol w:w="864"/>
+        <w:gridCol w:w="1296"/>
+        <w:gridCol w:w="2736"/>
       </w:tblGrid>
       <w:tr>
         <w:tc>
@@ -1413,7 +1411,7 @@
                 <w:color w:val="FFFFFF"/>
                 <w:sz w:val="18"/>
               </w:rPr>
-              <w:t>Eje Formativo Central</w:t>
+              <w:t>Área de Formación</w:t>
             </w:r>
           </w:p>
         </w:tc>
@@ -1433,7 +1431,7 @@
                 <w:color w:val="FFFFFF"/>
                 <w:sz w:val="18"/>
               </w:rPr>
-              <w:t>Distribución Híbrida</w:t>
+              <w:t>Horas</w:t>
             </w:r>
           </w:p>
         </w:tc>
@@ -1453,7 +1451,7 @@
                 <w:color w:val="FFFFFF"/>
                 <w:sz w:val="18"/>
               </w:rPr>
-              <w:t>Proyecto Práctico Evaluado (≥ 75 pts)</w:t>
+              <w:t>Sesiones</w:t>
             </w:r>
           </w:p>
         </w:tc>
@@ -1473,7 +1471,7 @@
                 <w:color w:val="FFFFFF"/>
                 <w:sz w:val="18"/>
               </w:rPr>
-              <w:t>Total</w:t>
+              <w:t>Evidencia Principal del Módulo</w:t>
             </w:r>
           </w:p>
         </w:tc>
@@ -1484,10 +1482,10 @@
             <w:tcW w:type="dxa" w:w="1872"/>
             <w:shd w:fill="F7FAFC"/>
             <w:tcMar>
-              <w:top w:w="60" w:type="dxa"/>
-              <w:bottom w:w="60" w:type="dxa"/>
-              <w:left w:w="70" w:type="dxa"/>
-              <w:right w:w="70" w:type="dxa"/>
+              <w:top w:w="55" w:type="dxa"/>
+              <w:bottom w:w="55" w:type="dxa"/>
+              <w:left w:w="65" w:type="dxa"/>
+              <w:right w:w="65" w:type="dxa"/>
             </w:tcMar>
           </w:tcPr>
           <w:p>
@@ -1510,10 +1508,10 @@
             <w:tcW w:type="dxa" w:w="1872"/>
             <w:shd w:fill="F7FAFC"/>
             <w:tcMar>
-              <w:top w:w="60" w:type="dxa"/>
-              <w:bottom w:w="60" w:type="dxa"/>
-              <w:left w:w="70" w:type="dxa"/>
-              <w:right w:w="70" w:type="dxa"/>
+              <w:top w:w="55" w:type="dxa"/>
+              <w:bottom w:w="55" w:type="dxa"/>
+              <w:left w:w="65" w:type="dxa"/>
+              <w:right w:w="65" w:type="dxa"/>
             </w:tcMar>
           </w:tcPr>
           <w:p>
@@ -1526,7 +1524,7 @@
                 <w:color w:val="1A202C"/>
                 <w:sz w:val="17"/>
               </w:rPr>
-              <w:t>Redes Seguras y Arquitectura de Ciberdefensa</w:t>
+              <w:t>Sistemas y gestión informática para la seguridad</w:t>
             </w:r>
           </w:p>
         </w:tc>
@@ -1535,62 +1533,10 @@
             <w:tcW w:type="dxa" w:w="1872"/>
             <w:shd w:fill="F7FAFC"/>
             <w:tcMar>
-              <w:top w:w="60" w:type="dxa"/>
-              <w:bottom w:w="60" w:type="dxa"/>
-              <w:left w:w="70" w:type="dxa"/>
-              <w:right w:w="70" w:type="dxa"/>
-            </w:tcMar>
-          </w:tcPr>
-          <w:p>
-            <w:pPr>
-              <w:spacing w:before="0" w:after="0" w:line="276" w:lineRule="auto"/>
-            </w:pPr>
-            <w:r>
-              <w:rPr>
-                <w:rFonts w:ascii="Calibri" w:hAnsi="Calibri"/>
-                <w:color w:val="1A202C"/>
-                <w:sz w:val="17"/>
-              </w:rPr>
-              <w:t>12h Virtuales</w:t>
-              <w:br/>
-              <w:t>4h Presenciales*</w:t>
-            </w:r>
-          </w:p>
-        </w:tc>
-        <w:tc>
-          <w:tcPr>
-            <w:tcW w:type="dxa" w:w="1872"/>
-            <w:shd w:fill="F7FAFC"/>
-            <w:tcMar>
-              <w:top w:w="60" w:type="dxa"/>
-              <w:bottom w:w="60" w:type="dxa"/>
-              <w:left w:w="70" w:type="dxa"/>
-              <w:right w:w="70" w:type="dxa"/>
-            </w:tcMar>
-          </w:tcPr>
-          <w:p>
-            <w:pPr>
-              <w:spacing w:before="0" w:after="0" w:line="276" w:lineRule="auto"/>
-            </w:pPr>
-            <w:r>
-              <w:rPr>
-                <w:rFonts w:ascii="Calibri" w:hAnsi="Calibri"/>
-                <w:color w:val="1A202C"/>
-                <w:sz w:val="17"/>
-              </w:rPr>
-              <w:t>Auditoría de tráfico con Wireshark y configuración de reglas de firewall perimetral</w:t>
-            </w:r>
-          </w:p>
-        </w:tc>
-        <w:tc>
-          <w:tcPr>
-            <w:tcW w:type="dxa" w:w="1872"/>
-            <w:shd w:fill="F7FAFC"/>
-            <w:tcMar>
-              <w:top w:w="60" w:type="dxa"/>
-              <w:bottom w:w="60" w:type="dxa"/>
-              <w:left w:w="70" w:type="dxa"/>
-              <w:right w:w="70" w:type="dxa"/>
+              <w:top w:w="55" w:type="dxa"/>
+              <w:bottom w:w="55" w:type="dxa"/>
+              <w:left w:w="65" w:type="dxa"/>
+              <w:right w:w="65" w:type="dxa"/>
             </w:tcMar>
           </w:tcPr>
           <w:p>
@@ -1604,7 +1550,57 @@
                 <w:color w:val="1A202C"/>
                 <w:sz w:val="17"/>
               </w:rPr>
-              <w:t>16 h</w:t>
+              <w:t>12 h</w:t>
+            </w:r>
+          </w:p>
+        </w:tc>
+        <w:tc>
+          <w:tcPr>
+            <w:tcW w:type="dxa" w:w="1872"/>
+            <w:shd w:fill="F7FAFC"/>
+            <w:tcMar>
+              <w:top w:w="55" w:type="dxa"/>
+              <w:bottom w:w="55" w:type="dxa"/>
+              <w:left w:w="65" w:type="dxa"/>
+              <w:right w:w="65" w:type="dxa"/>
+            </w:tcMar>
+          </w:tcPr>
+          <w:p>
+            <w:pPr>
+              <w:spacing w:before="0" w:after="0" w:line="276" w:lineRule="auto"/>
+            </w:pPr>
+            <w:r>
+              <w:rPr>
+                <w:rFonts w:ascii="Calibri" w:hAnsi="Calibri"/>
+                <w:color w:val="1A202C"/>
+                <w:sz w:val="17"/>
+              </w:rPr>
+              <w:t>Sesiones 1-3</w:t>
+            </w:r>
+          </w:p>
+        </w:tc>
+        <w:tc>
+          <w:tcPr>
+            <w:tcW w:type="dxa" w:w="1872"/>
+            <w:shd w:fill="F7FAFC"/>
+            <w:tcMar>
+              <w:top w:w="55" w:type="dxa"/>
+              <w:bottom w:w="55" w:type="dxa"/>
+              <w:left w:w="65" w:type="dxa"/>
+              <w:right w:w="65" w:type="dxa"/>
+            </w:tcMar>
+          </w:tcPr>
+          <w:p>
+            <w:pPr>
+              <w:spacing w:before="0" w:after="0" w:line="276" w:lineRule="auto"/>
+            </w:pPr>
+            <w:r>
+              <w:rPr>
+                <w:rFonts w:ascii="Calibri" w:hAnsi="Calibri"/>
+                <w:color w:val="1A202C"/>
+                <w:sz w:val="17"/>
+              </w:rPr>
+              <w:t>Diagrama del sistema con equipos, red, servidor, SaaS y registro de incidente.</w:t>
             </w:r>
           </w:p>
         </w:tc>
@@ -1614,10 +1610,10 @@
           <w:tcPr>
             <w:tcW w:type="dxa" w:w="1872"/>
             <w:tcMar>
-              <w:top w:w="60" w:type="dxa"/>
-              <w:bottom w:w="60" w:type="dxa"/>
-              <w:left w:w="70" w:type="dxa"/>
-              <w:right w:w="70" w:type="dxa"/>
+              <w:top w:w="55" w:type="dxa"/>
+              <w:bottom w:w="55" w:type="dxa"/>
+              <w:left w:w="65" w:type="dxa"/>
+              <w:right w:w="65" w:type="dxa"/>
             </w:tcMar>
           </w:tcPr>
           <w:p>
@@ -1639,10 +1635,10 @@
           <w:tcPr>
             <w:tcW w:type="dxa" w:w="1872"/>
             <w:tcMar>
-              <w:top w:w="60" w:type="dxa"/>
-              <w:bottom w:w="60" w:type="dxa"/>
-              <w:left w:w="70" w:type="dxa"/>
-              <w:right w:w="70" w:type="dxa"/>
+              <w:top w:w="55" w:type="dxa"/>
+              <w:bottom w:w="55" w:type="dxa"/>
+              <w:left w:w="65" w:type="dxa"/>
+              <w:right w:w="65" w:type="dxa"/>
             </w:tcMar>
           </w:tcPr>
           <w:p>
@@ -1655,7 +1651,7 @@
                 <w:color w:val="1A202C"/>
                 <w:sz w:val="17"/>
               </w:rPr>
-              <w:t>Hardening de S.O., Identidad y Accesos</w:t>
+              <w:t>Identidad y control de acceso en aplicaciones</w:t>
             </w:r>
           </w:p>
         </w:tc>
@@ -1663,60 +1659,10 @@
           <w:tcPr>
             <w:tcW w:type="dxa" w:w="1872"/>
             <w:tcMar>
-              <w:top w:w="60" w:type="dxa"/>
-              <w:bottom w:w="60" w:type="dxa"/>
-              <w:left w:w="70" w:type="dxa"/>
-              <w:right w:w="70" w:type="dxa"/>
-            </w:tcMar>
-          </w:tcPr>
-          <w:p>
-            <w:pPr>
-              <w:spacing w:before="0" w:after="0" w:line="276" w:lineRule="auto"/>
-            </w:pPr>
-            <w:r>
-              <w:rPr>
-                <w:rFonts w:ascii="Calibri" w:hAnsi="Calibri"/>
-                <w:color w:val="1A202C"/>
-                <w:sz w:val="17"/>
-              </w:rPr>
-              <w:t>12h Virtuales</w:t>
-              <w:br/>
-              <w:t>4h Presenciales*</w:t>
-            </w:r>
-          </w:p>
-        </w:tc>
-        <w:tc>
-          <w:tcPr>
-            <w:tcW w:type="dxa" w:w="1872"/>
-            <w:tcMar>
-              <w:top w:w="60" w:type="dxa"/>
-              <w:bottom w:w="60" w:type="dxa"/>
-              <w:left w:w="70" w:type="dxa"/>
-              <w:right w:w="70" w:type="dxa"/>
-            </w:tcMar>
-          </w:tcPr>
-          <w:p>
-            <w:pPr>
-              <w:spacing w:before="0" w:after="0" w:line="276" w:lineRule="auto"/>
-            </w:pPr>
-            <w:r>
-              <w:rPr>
-                <w:rFonts w:ascii="Calibri" w:hAnsi="Calibri"/>
-                <w:color w:val="1A202C"/>
-                <w:sz w:val="17"/>
-              </w:rPr>
-              <w:t>Plantilla de bastionado seguro (GPO / scripts) verificada con escáner de cumplimiento</w:t>
-            </w:r>
-          </w:p>
-        </w:tc>
-        <w:tc>
-          <w:tcPr>
-            <w:tcW w:type="dxa" w:w="1872"/>
-            <w:tcMar>
-              <w:top w:w="60" w:type="dxa"/>
-              <w:bottom w:w="60" w:type="dxa"/>
-              <w:left w:w="70" w:type="dxa"/>
-              <w:right w:w="70" w:type="dxa"/>
+              <w:top w:w="55" w:type="dxa"/>
+              <w:bottom w:w="55" w:type="dxa"/>
+              <w:left w:w="65" w:type="dxa"/>
+              <w:right w:w="65" w:type="dxa"/>
             </w:tcMar>
           </w:tcPr>
           <w:p>
@@ -1730,7 +1676,55 @@
                 <w:color w:val="1A202C"/>
                 <w:sz w:val="17"/>
               </w:rPr>
-              <w:t>16 h</w:t>
+              <w:t>12 h</w:t>
+            </w:r>
+          </w:p>
+        </w:tc>
+        <w:tc>
+          <w:tcPr>
+            <w:tcW w:type="dxa" w:w="1872"/>
+            <w:tcMar>
+              <w:top w:w="55" w:type="dxa"/>
+              <w:bottom w:w="55" w:type="dxa"/>
+              <w:left w:w="65" w:type="dxa"/>
+              <w:right w:w="65" w:type="dxa"/>
+            </w:tcMar>
+          </w:tcPr>
+          <w:p>
+            <w:pPr>
+              <w:spacing w:before="0" w:after="0" w:line="276" w:lineRule="auto"/>
+            </w:pPr>
+            <w:r>
+              <w:rPr>
+                <w:rFonts w:ascii="Calibri" w:hAnsi="Calibri"/>
+                <w:color w:val="1A202C"/>
+                <w:sz w:val="17"/>
+              </w:rPr>
+              <w:t>Sesiones 4-6</w:t>
+            </w:r>
+          </w:p>
+        </w:tc>
+        <w:tc>
+          <w:tcPr>
+            <w:tcW w:type="dxa" w:w="1872"/>
+            <w:tcMar>
+              <w:top w:w="55" w:type="dxa"/>
+              <w:bottom w:w="55" w:type="dxa"/>
+              <w:left w:w="65" w:type="dxa"/>
+              <w:right w:w="65" w:type="dxa"/>
+            </w:tcMar>
+          </w:tcPr>
+          <w:p>
+            <w:pPr>
+              <w:spacing w:before="0" w:after="0" w:line="276" w:lineRule="auto"/>
+            </w:pPr>
+            <w:r>
+              <w:rPr>
+                <w:rFonts w:ascii="Calibri" w:hAnsi="Calibri"/>
+                <w:color w:val="1A202C"/>
+                <w:sz w:val="17"/>
+              </w:rPr>
+              <w:t>Flujo de sesión local/federado, matriz RBAC y procedimiento de baja de usuario.</w:t>
             </w:r>
           </w:p>
         </w:tc>
@@ -1741,10 +1735,10 @@
             <w:tcW w:type="dxa" w:w="1872"/>
             <w:shd w:fill="F7FAFC"/>
             <w:tcMar>
-              <w:top w:w="60" w:type="dxa"/>
-              <w:bottom w:w="60" w:type="dxa"/>
-              <w:left w:w="70" w:type="dxa"/>
-              <w:right w:w="70" w:type="dxa"/>
+              <w:top w:w="55" w:type="dxa"/>
+              <w:bottom w:w="55" w:type="dxa"/>
+              <w:left w:w="65" w:type="dxa"/>
+              <w:right w:w="65" w:type="dxa"/>
             </w:tcMar>
           </w:tcPr>
           <w:p>
@@ -1767,10 +1761,10 @@
             <w:tcW w:type="dxa" w:w="1872"/>
             <w:shd w:fill="F7FAFC"/>
             <w:tcMar>
-              <w:top w:w="60" w:type="dxa"/>
-              <w:bottom w:w="60" w:type="dxa"/>
-              <w:left w:w="70" w:type="dxa"/>
-              <w:right w:w="70" w:type="dxa"/>
+              <w:top w:w="55" w:type="dxa"/>
+              <w:bottom w:w="55" w:type="dxa"/>
+              <w:left w:w="65" w:type="dxa"/>
+              <w:right w:w="65" w:type="dxa"/>
             </w:tcMar>
           </w:tcPr>
           <w:p>
@@ -1783,7 +1777,7 @@
                 <w:color w:val="1A202C"/>
                 <w:sz w:val="17"/>
               </w:rPr>
-              <w:t>Operaciones SOC y Monitoreo SIEM</w:t>
+              <w:t>Diseño de controles y responsabilidades</w:t>
             </w:r>
           </w:p>
         </w:tc>
@@ -1792,62 +1786,10 @@
             <w:tcW w:type="dxa" w:w="1872"/>
             <w:shd w:fill="F7FAFC"/>
             <w:tcMar>
-              <w:top w:w="60" w:type="dxa"/>
-              <w:bottom w:w="60" w:type="dxa"/>
-              <w:left w:w="70" w:type="dxa"/>
-              <w:right w:w="70" w:type="dxa"/>
-            </w:tcMar>
-          </w:tcPr>
-          <w:p>
-            <w:pPr>
-              <w:spacing w:before="0" w:after="0" w:line="276" w:lineRule="auto"/>
-            </w:pPr>
-            <w:r>
-              <w:rPr>
-                <w:rFonts w:ascii="Calibri" w:hAnsi="Calibri"/>
-                <w:color w:val="1A202C"/>
-                <w:sz w:val="17"/>
-              </w:rPr>
-              <w:t>16h Virtuales</w:t>
-              <w:br/>
-              <w:t>(Intensivo SIEM)</w:t>
-            </w:r>
-          </w:p>
-        </w:tc>
-        <w:tc>
-          <w:tcPr>
-            <w:tcW w:type="dxa" w:w="1872"/>
-            <w:shd w:fill="F7FAFC"/>
-            <w:tcMar>
-              <w:top w:w="60" w:type="dxa"/>
-              <w:bottom w:w="60" w:type="dxa"/>
-              <w:left w:w="70" w:type="dxa"/>
-              <w:right w:w="70" w:type="dxa"/>
-            </w:tcMar>
-          </w:tcPr>
-          <w:p>
-            <w:pPr>
-              <w:spacing w:before="0" w:after="0" w:line="276" w:lineRule="auto"/>
-            </w:pPr>
-            <w:r>
-              <w:rPr>
-                <w:rFonts w:ascii="Calibri" w:hAnsi="Calibri"/>
-                <w:color w:val="1A202C"/>
-                <w:sz w:val="17"/>
-              </w:rPr>
-              <w:t>Despliegue de agentes Wazuh, triaje de alertas y elaboración de tickets formales</w:t>
-            </w:r>
-          </w:p>
-        </w:tc>
-        <w:tc>
-          <w:tcPr>
-            <w:tcW w:type="dxa" w:w="1872"/>
-            <w:shd w:fill="F7FAFC"/>
-            <w:tcMar>
-              <w:top w:w="60" w:type="dxa"/>
-              <w:bottom w:w="60" w:type="dxa"/>
-              <w:left w:w="70" w:type="dxa"/>
-              <w:right w:w="70" w:type="dxa"/>
+              <w:top w:w="55" w:type="dxa"/>
+              <w:bottom w:w="55" w:type="dxa"/>
+              <w:left w:w="65" w:type="dxa"/>
+              <w:right w:w="65" w:type="dxa"/>
             </w:tcMar>
           </w:tcPr>
           <w:p>
@@ -1861,7 +1803,57 @@
                 <w:color w:val="1A202C"/>
                 <w:sz w:val="17"/>
               </w:rPr>
-              <w:t>16 h</w:t>
+              <w:t>8 h</w:t>
+            </w:r>
+          </w:p>
+        </w:tc>
+        <w:tc>
+          <w:tcPr>
+            <w:tcW w:type="dxa" w:w="1872"/>
+            <w:shd w:fill="F7FAFC"/>
+            <w:tcMar>
+              <w:top w:w="55" w:type="dxa"/>
+              <w:bottom w:w="55" w:type="dxa"/>
+              <w:left w:w="65" w:type="dxa"/>
+              <w:right w:w="65" w:type="dxa"/>
+            </w:tcMar>
+          </w:tcPr>
+          <w:p>
+            <w:pPr>
+              <w:spacing w:before="0" w:after="0" w:line="276" w:lineRule="auto"/>
+            </w:pPr>
+            <w:r>
+              <w:rPr>
+                <w:rFonts w:ascii="Calibri" w:hAnsi="Calibri"/>
+                <w:color w:val="1A202C"/>
+                <w:sz w:val="17"/>
+              </w:rPr>
+              <w:t>Sesiones 7-8</w:t>
+            </w:r>
+          </w:p>
+        </w:tc>
+        <w:tc>
+          <w:tcPr>
+            <w:tcW w:type="dxa" w:w="1872"/>
+            <w:shd w:fill="F7FAFC"/>
+            <w:tcMar>
+              <w:top w:w="55" w:type="dxa"/>
+              <w:bottom w:w="55" w:type="dxa"/>
+              <w:left w:w="65" w:type="dxa"/>
+              <w:right w:w="65" w:type="dxa"/>
+            </w:tcMar>
+          </w:tcPr>
+          <w:p>
+            <w:pPr>
+              <w:spacing w:before="0" w:after="0" w:line="276" w:lineRule="auto"/>
+            </w:pPr>
+            <w:r>
+              <w:rPr>
+                <w:rFonts w:ascii="Calibri" w:hAnsi="Calibri"/>
+                <w:color w:val="1A202C"/>
+                <w:sz w:val="17"/>
+              </w:rPr>
+              <w:t>Diseño de acceso temporal, roles separados y reconstrucción con ticket y logs SIEM.</w:t>
             </w:r>
           </w:p>
         </w:tc>
@@ -1871,10 +1863,10 @@
           <w:tcPr>
             <w:tcW w:type="dxa" w:w="1872"/>
             <w:tcMar>
-              <w:top w:w="60" w:type="dxa"/>
-              <w:bottom w:w="60" w:type="dxa"/>
-              <w:left w:w="70" w:type="dxa"/>
-              <w:right w:w="70" w:type="dxa"/>
+              <w:top w:w="55" w:type="dxa"/>
+              <w:bottom w:w="55" w:type="dxa"/>
+              <w:left w:w="65" w:type="dxa"/>
+              <w:right w:w="65" w:type="dxa"/>
             </w:tcMar>
           </w:tcPr>
           <w:p>
@@ -1896,10 +1888,10 @@
           <w:tcPr>
             <w:tcW w:type="dxa" w:w="1872"/>
             <w:tcMar>
-              <w:top w:w="60" w:type="dxa"/>
-              <w:bottom w:w="60" w:type="dxa"/>
-              <w:left w:w="70" w:type="dxa"/>
-              <w:right w:w="70" w:type="dxa"/>
+              <w:top w:w="55" w:type="dxa"/>
+              <w:bottom w:w="55" w:type="dxa"/>
+              <w:left w:w="65" w:type="dxa"/>
+              <w:right w:w="65" w:type="dxa"/>
             </w:tcMar>
           </w:tcPr>
           <w:p>
@@ -1912,7 +1904,7 @@
                 <w:color w:val="1A202C"/>
                 <w:sz w:val="17"/>
               </w:rPr>
-              <w:t>Detección de Amenazas y Vulnerabilidades</w:t>
+              <w:t>Seguridad de comunicaciones web y APIs</w:t>
             </w:r>
           </w:p>
         </w:tc>
@@ -1920,60 +1912,10 @@
           <w:tcPr>
             <w:tcW w:type="dxa" w:w="1872"/>
             <w:tcMar>
-              <w:top w:w="60" w:type="dxa"/>
-              <w:bottom w:w="60" w:type="dxa"/>
-              <w:left w:w="70" w:type="dxa"/>
-              <w:right w:w="70" w:type="dxa"/>
-            </w:tcMar>
-          </w:tcPr>
-          <w:p>
-            <w:pPr>
-              <w:spacing w:before="0" w:after="0" w:line="276" w:lineRule="auto"/>
-            </w:pPr>
-            <w:r>
-              <w:rPr>
-                <w:rFonts w:ascii="Calibri" w:hAnsi="Calibri"/>
-                <w:color w:val="1A202C"/>
-                <w:sz w:val="17"/>
-              </w:rPr>
-              <w:t>12h Virtuales</w:t>
-              <w:br/>
-              <w:t>4h Presenciales**</w:t>
-            </w:r>
-          </w:p>
-        </w:tc>
-        <w:tc>
-          <w:tcPr>
-            <w:tcW w:type="dxa" w:w="1872"/>
-            <w:tcMar>
-              <w:top w:w="60" w:type="dxa"/>
-              <w:bottom w:w="60" w:type="dxa"/>
-              <w:left w:w="70" w:type="dxa"/>
-              <w:right w:w="70" w:type="dxa"/>
-            </w:tcMar>
-          </w:tcPr>
-          <w:p>
-            <w:pPr>
-              <w:spacing w:before="0" w:after="0" w:line="276" w:lineRule="auto"/>
-            </w:pPr>
-            <w:r>
-              <w:rPr>
-                <w:rFonts w:ascii="Calibri" w:hAnsi="Calibri"/>
-                <w:color w:val="1A202C"/>
-                <w:sz w:val="17"/>
-              </w:rPr>
-              <w:t>Informe técnico de análisis de phishing y plan de remediación de vulnerabilidades</w:t>
-            </w:r>
-          </w:p>
-        </w:tc>
-        <w:tc>
-          <w:tcPr>
-            <w:tcW w:type="dxa" w:w="1872"/>
-            <w:tcMar>
-              <w:top w:w="60" w:type="dxa"/>
-              <w:bottom w:w="60" w:type="dxa"/>
-              <w:left w:w="70" w:type="dxa"/>
-              <w:right w:w="70" w:type="dxa"/>
+              <w:top w:w="55" w:type="dxa"/>
+              <w:bottom w:w="55" w:type="dxa"/>
+              <w:left w:w="65" w:type="dxa"/>
+              <w:right w:w="65" w:type="dxa"/>
             </w:tcMar>
           </w:tcPr>
           <w:p>
@@ -1987,7 +1929,55 @@
                 <w:color w:val="1A202C"/>
                 <w:sz w:val="17"/>
               </w:rPr>
-              <w:t>16 h</w:t>
+              <w:t>12 h</w:t>
+            </w:r>
+          </w:p>
+        </w:tc>
+        <w:tc>
+          <w:tcPr>
+            <w:tcW w:type="dxa" w:w="1872"/>
+            <w:tcMar>
+              <w:top w:w="55" w:type="dxa"/>
+              <w:bottom w:w="55" w:type="dxa"/>
+              <w:left w:w="65" w:type="dxa"/>
+              <w:right w:w="65" w:type="dxa"/>
+            </w:tcMar>
+          </w:tcPr>
+          <w:p>
+            <w:pPr>
+              <w:spacing w:before="0" w:after="0" w:line="276" w:lineRule="auto"/>
+            </w:pPr>
+            <w:r>
+              <w:rPr>
+                <w:rFonts w:ascii="Calibri" w:hAnsi="Calibri"/>
+                <w:color w:val="1A202C"/>
+                <w:sz w:val="17"/>
+              </w:rPr>
+              <w:t>Sesiones 9-11</w:t>
+            </w:r>
+          </w:p>
+        </w:tc>
+        <w:tc>
+          <w:tcPr>
+            <w:tcW w:type="dxa" w:w="1872"/>
+            <w:tcMar>
+              <w:top w:w="55" w:type="dxa"/>
+              <w:bottom w:w="55" w:type="dxa"/>
+              <w:left w:w="65" w:type="dxa"/>
+              <w:right w:w="65" w:type="dxa"/>
+            </w:tcMar>
+          </w:tcPr>
+          <w:p>
+            <w:pPr>
+              <w:spacing w:before="0" w:after="0" w:line="276" w:lineRule="auto"/>
+            </w:pPr>
+            <w:r>
+              <w:rPr>
+                <w:rFonts w:ascii="Calibri" w:hAnsi="Calibri"/>
+                <w:color w:val="1A202C"/>
+                <w:sz w:val="17"/>
+              </w:rPr>
+              <w:t>Trazado del recorrido web, revisión de certificados y petición de API segura.</w:t>
             </w:r>
           </w:p>
         </w:tc>
@@ -1998,10 +1988,10 @@
             <w:tcW w:type="dxa" w:w="1872"/>
             <w:shd w:fill="F7FAFC"/>
             <w:tcMar>
-              <w:top w:w="60" w:type="dxa"/>
-              <w:bottom w:w="60" w:type="dxa"/>
-              <w:left w:w="70" w:type="dxa"/>
-              <w:right w:w="70" w:type="dxa"/>
+              <w:top w:w="55" w:type="dxa"/>
+              <w:bottom w:w="55" w:type="dxa"/>
+              <w:left w:w="65" w:type="dxa"/>
+              <w:right w:w="65" w:type="dxa"/>
             </w:tcMar>
           </w:tcPr>
           <w:p>
@@ -2024,10 +2014,10 @@
             <w:tcW w:type="dxa" w:w="1872"/>
             <w:shd w:fill="F7FAFC"/>
             <w:tcMar>
-              <w:top w:w="60" w:type="dxa"/>
-              <w:bottom w:w="60" w:type="dxa"/>
-              <w:left w:w="70" w:type="dxa"/>
-              <w:right w:w="70" w:type="dxa"/>
+              <w:top w:w="55" w:type="dxa"/>
+              <w:bottom w:w="55" w:type="dxa"/>
+              <w:left w:w="65" w:type="dxa"/>
+              <w:right w:w="65" w:type="dxa"/>
             </w:tcMar>
           </w:tcPr>
           <w:p>
@@ -2040,7 +2030,7 @@
                 <w:color w:val="1A202C"/>
                 <w:sz w:val="17"/>
               </w:rPr>
-              <w:t>Respuesta a Incidentes y Reto Capstone</w:t>
+              <w:t>Ciclo de vida y gestión de vulnerabilidades</w:t>
             </w:r>
           </w:p>
         </w:tc>
@@ -2049,62 +2039,10 @@
             <w:tcW w:type="dxa" w:w="1872"/>
             <w:shd w:fill="F7FAFC"/>
             <w:tcMar>
-              <w:top w:w="60" w:type="dxa"/>
-              <w:bottom w:w="60" w:type="dxa"/>
-              <w:left w:w="70" w:type="dxa"/>
-              <w:right w:w="70" w:type="dxa"/>
-            </w:tcMar>
-          </w:tcPr>
-          <w:p>
-            <w:pPr>
-              <w:spacing w:before="0" w:after="0" w:line="276" w:lineRule="auto"/>
-            </w:pPr>
-            <w:r>
-              <w:rPr>
-                <w:rFonts w:ascii="Calibri" w:hAnsi="Calibri"/>
-                <w:color w:val="1A202C"/>
-                <w:sz w:val="17"/>
-              </w:rPr>
-              <w:t>12h Virtuales</w:t>
-              <w:br/>
-              <w:t>4h Presenciales**</w:t>
-            </w:r>
-          </w:p>
-        </w:tc>
-        <w:tc>
-          <w:tcPr>
-            <w:tcW w:type="dxa" w:w="1872"/>
-            <w:shd w:fill="F7FAFC"/>
-            <w:tcMar>
-              <w:top w:w="60" w:type="dxa"/>
-              <w:bottom w:w="60" w:type="dxa"/>
-              <w:left w:w="70" w:type="dxa"/>
-              <w:right w:w="70" w:type="dxa"/>
-            </w:tcMar>
-          </w:tcPr>
-          <w:p>
-            <w:pPr>
-              <w:spacing w:before="0" w:after="0" w:line="276" w:lineRule="auto"/>
-            </w:pPr>
-            <w:r>
-              <w:rPr>
-                <w:rFonts w:ascii="Calibri" w:hAnsi="Calibri"/>
-                <w:color w:val="1A202C"/>
-                <w:sz w:val="17"/>
-              </w:rPr>
-              <w:t>Proyecto Capstone: Simulación de crisis SOC (Blue Team), contención y defensa oral</w:t>
-            </w:r>
-          </w:p>
-        </w:tc>
-        <w:tc>
-          <w:tcPr>
-            <w:tcW w:type="dxa" w:w="1872"/>
-            <w:shd w:fill="F7FAFC"/>
-            <w:tcMar>
-              <w:top w:w="60" w:type="dxa"/>
-              <w:bottom w:w="60" w:type="dxa"/>
-              <w:left w:w="70" w:type="dxa"/>
-              <w:right w:w="70" w:type="dxa"/>
+              <w:top w:w="55" w:type="dxa"/>
+              <w:bottom w:w="55" w:type="dxa"/>
+              <w:left w:w="65" w:type="dxa"/>
+              <w:right w:w="65" w:type="dxa"/>
             </w:tcMar>
           </w:tcPr>
           <w:p>
@@ -2118,28 +2056,439 @@
                 <w:color w:val="1A202C"/>
                 <w:sz w:val="17"/>
               </w:rPr>
-              <w:t>16 h</w:t>
+              <w:t>12 h</w:t>
+            </w:r>
+          </w:p>
+        </w:tc>
+        <w:tc>
+          <w:tcPr>
+            <w:tcW w:type="dxa" w:w="1872"/>
+            <w:shd w:fill="F7FAFC"/>
+            <w:tcMar>
+              <w:top w:w="55" w:type="dxa"/>
+              <w:bottom w:w="55" w:type="dxa"/>
+              <w:left w:w="65" w:type="dxa"/>
+              <w:right w:w="65" w:type="dxa"/>
+            </w:tcMar>
+          </w:tcPr>
+          <w:p>
+            <w:pPr>
+              <w:spacing w:before="0" w:after="0" w:line="276" w:lineRule="auto"/>
+            </w:pPr>
+            <w:r>
+              <w:rPr>
+                <w:rFonts w:ascii="Calibri" w:hAnsi="Calibri"/>
+                <w:color w:val="1A202C"/>
+                <w:sz w:val="17"/>
+              </w:rPr>
+              <w:t>Sesiones 12-14</w:t>
+            </w:r>
+          </w:p>
+        </w:tc>
+        <w:tc>
+          <w:tcPr>
+            <w:tcW w:type="dxa" w:w="1872"/>
+            <w:shd w:fill="F7FAFC"/>
+            <w:tcMar>
+              <w:top w:w="55" w:type="dxa"/>
+              <w:bottom w:w="55" w:type="dxa"/>
+              <w:left w:w="65" w:type="dxa"/>
+              <w:right w:w="65" w:type="dxa"/>
+            </w:tcMar>
+          </w:tcPr>
+          <w:p>
+            <w:pPr>
+              <w:spacing w:before="0" w:after="0" w:line="276" w:lineRule="auto"/>
+            </w:pPr>
+            <w:r>
+              <w:rPr>
+                <w:rFonts w:ascii="Calibri" w:hAnsi="Calibri"/>
+                <w:color w:val="1A202C"/>
+                <w:sz w:val="17"/>
+              </w:rPr>
+              <w:t>Plan de ciclo de vida de inventario y tratamiento justificado de aviso CVE real.</w:t>
+            </w:r>
+          </w:p>
+        </w:tc>
+      </w:tr>
+      <w:tr>
+        <w:tc>
+          <w:tcPr>
+            <w:tcW w:type="dxa" w:w="1872"/>
+            <w:tcMar>
+              <w:top w:w="55" w:type="dxa"/>
+              <w:bottom w:w="55" w:type="dxa"/>
+              <w:left w:w="65" w:type="dxa"/>
+              <w:right w:w="65" w:type="dxa"/>
+            </w:tcMar>
+          </w:tcPr>
+          <w:p>
+            <w:pPr>
+              <w:spacing w:before="0" w:after="0" w:line="276" w:lineRule="auto"/>
+            </w:pPr>
+            <w:r>
+              <w:rPr>
+                <w:rFonts w:ascii="Calibri" w:hAnsi="Calibri"/>
+                <w:b/>
+                <w:color w:val="1A202C"/>
+                <w:sz w:val="17"/>
+              </w:rPr>
+              <w:t>Módulo 6</w:t>
+            </w:r>
+          </w:p>
+        </w:tc>
+        <w:tc>
+          <w:tcPr>
+            <w:tcW w:type="dxa" w:w="1872"/>
+            <w:tcMar>
+              <w:top w:w="55" w:type="dxa"/>
+              <w:bottom w:w="55" w:type="dxa"/>
+              <w:left w:w="65" w:type="dxa"/>
+              <w:right w:w="65" w:type="dxa"/>
+            </w:tcMar>
+          </w:tcPr>
+          <w:p>
+            <w:pPr>
+              <w:spacing w:before="0" w:after="0" w:line="276" w:lineRule="auto"/>
+            </w:pPr>
+            <w:r>
+              <w:rPr>
+                <w:rFonts w:ascii="Calibri" w:hAnsi="Calibri"/>
+                <w:color w:val="1A202C"/>
+                <w:sz w:val="17"/>
+              </w:rPr>
+              <w:t>Documentación y gestión del riesgo de seguridad</w:t>
+            </w:r>
+          </w:p>
+        </w:tc>
+        <w:tc>
+          <w:tcPr>
+            <w:tcW w:type="dxa" w:w="1872"/>
+            <w:tcMar>
+              <w:top w:w="55" w:type="dxa"/>
+              <w:bottom w:w="55" w:type="dxa"/>
+              <w:left w:w="65" w:type="dxa"/>
+              <w:right w:w="65" w:type="dxa"/>
+            </w:tcMar>
+          </w:tcPr>
+          <w:p>
+            <w:pPr>
+              <w:spacing w:before="0" w:after="0" w:line="276" w:lineRule="auto"/>
+            </w:pPr>
+            <w:r>
+              <w:rPr>
+                <w:rFonts w:ascii="Calibri" w:hAnsi="Calibri"/>
+                <w:b/>
+                <w:color w:val="1A202C"/>
+                <w:sz w:val="17"/>
+              </w:rPr>
+              <w:t>8 h</w:t>
+            </w:r>
+          </w:p>
+        </w:tc>
+        <w:tc>
+          <w:tcPr>
+            <w:tcW w:type="dxa" w:w="1872"/>
+            <w:tcMar>
+              <w:top w:w="55" w:type="dxa"/>
+              <w:bottom w:w="55" w:type="dxa"/>
+              <w:left w:w="65" w:type="dxa"/>
+              <w:right w:w="65" w:type="dxa"/>
+            </w:tcMar>
+          </w:tcPr>
+          <w:p>
+            <w:pPr>
+              <w:spacing w:before="0" w:after="0" w:line="276" w:lineRule="auto"/>
+            </w:pPr>
+            <w:r>
+              <w:rPr>
+                <w:rFonts w:ascii="Calibri" w:hAnsi="Calibri"/>
+                <w:color w:val="1A202C"/>
+                <w:sz w:val="17"/>
+              </w:rPr>
+              <w:t>Sesiones 15-16</w:t>
+            </w:r>
+          </w:p>
+        </w:tc>
+        <w:tc>
+          <w:tcPr>
+            <w:tcW w:type="dxa" w:w="1872"/>
+            <w:tcMar>
+              <w:top w:w="55" w:type="dxa"/>
+              <w:bottom w:w="55" w:type="dxa"/>
+              <w:left w:w="65" w:type="dxa"/>
+              <w:right w:w="65" w:type="dxa"/>
+            </w:tcMar>
+          </w:tcPr>
+          <w:p>
+            <w:pPr>
+              <w:spacing w:before="0" w:after="0" w:line="276" w:lineRule="auto"/>
+            </w:pPr>
+            <w:r>
+              <w:rPr>
+                <w:rFonts w:ascii="Calibri" w:hAnsi="Calibri"/>
+                <w:color w:val="1A202C"/>
+                <w:sz w:val="17"/>
+              </w:rPr>
+              <w:t>Política de accesos, SOP de baja, evaluación de riesgo y solicitud de aceptación.</w:t>
+            </w:r>
+          </w:p>
+        </w:tc>
+      </w:tr>
+      <w:tr>
+        <w:tc>
+          <w:tcPr>
+            <w:tcW w:type="dxa" w:w="1872"/>
+            <w:shd w:fill="F7FAFC"/>
+            <w:tcMar>
+              <w:top w:w="55" w:type="dxa"/>
+              <w:bottom w:w="55" w:type="dxa"/>
+              <w:left w:w="65" w:type="dxa"/>
+              <w:right w:w="65" w:type="dxa"/>
+            </w:tcMar>
+          </w:tcPr>
+          <w:p>
+            <w:pPr>
+              <w:spacing w:before="0" w:after="0" w:line="276" w:lineRule="auto"/>
+            </w:pPr>
+            <w:r>
+              <w:rPr>
+                <w:rFonts w:ascii="Calibri" w:hAnsi="Calibri"/>
+                <w:b/>
+                <w:color w:val="1A202C"/>
+                <w:sz w:val="17"/>
+              </w:rPr>
+              <w:t>Módulo 7</w:t>
+            </w:r>
+          </w:p>
+        </w:tc>
+        <w:tc>
+          <w:tcPr>
+            <w:tcW w:type="dxa" w:w="1872"/>
+            <w:shd w:fill="F7FAFC"/>
+            <w:tcMar>
+              <w:top w:w="55" w:type="dxa"/>
+              <w:bottom w:w="55" w:type="dxa"/>
+              <w:left w:w="65" w:type="dxa"/>
+              <w:right w:w="65" w:type="dxa"/>
+            </w:tcMar>
+          </w:tcPr>
+          <w:p>
+            <w:pPr>
+              <w:spacing w:before="0" w:after="0" w:line="276" w:lineRule="auto"/>
+            </w:pPr>
+            <w:r>
+              <w:rPr>
+                <w:rFonts w:ascii="Calibri" w:hAnsi="Calibri"/>
+                <w:color w:val="1A202C"/>
+                <w:sz w:val="17"/>
+              </w:rPr>
+              <w:t>Estándares, regulaciones e informes de aseguramiento</w:t>
+            </w:r>
+          </w:p>
+        </w:tc>
+        <w:tc>
+          <w:tcPr>
+            <w:tcW w:type="dxa" w:w="1872"/>
+            <w:shd w:fill="F7FAFC"/>
+            <w:tcMar>
+              <w:top w:w="55" w:type="dxa"/>
+              <w:bottom w:w="55" w:type="dxa"/>
+              <w:left w:w="65" w:type="dxa"/>
+              <w:right w:w="65" w:type="dxa"/>
+            </w:tcMar>
+          </w:tcPr>
+          <w:p>
+            <w:pPr>
+              <w:spacing w:before="0" w:after="0" w:line="276" w:lineRule="auto"/>
+            </w:pPr>
+            <w:r>
+              <w:rPr>
+                <w:rFonts w:ascii="Calibri" w:hAnsi="Calibri"/>
+                <w:b/>
+                <w:color w:val="1A202C"/>
+                <w:sz w:val="17"/>
+              </w:rPr>
+              <w:t>8 h</w:t>
+            </w:r>
+          </w:p>
+        </w:tc>
+        <w:tc>
+          <w:tcPr>
+            <w:tcW w:type="dxa" w:w="1872"/>
+            <w:shd w:fill="F7FAFC"/>
+            <w:tcMar>
+              <w:top w:w="55" w:type="dxa"/>
+              <w:bottom w:w="55" w:type="dxa"/>
+              <w:left w:w="65" w:type="dxa"/>
+              <w:right w:w="65" w:type="dxa"/>
+            </w:tcMar>
+          </w:tcPr>
+          <w:p>
+            <w:pPr>
+              <w:spacing w:before="0" w:after="0" w:line="276" w:lineRule="auto"/>
+            </w:pPr>
+            <w:r>
+              <w:rPr>
+                <w:rFonts w:ascii="Calibri" w:hAnsi="Calibri"/>
+                <w:color w:val="1A202C"/>
+                <w:sz w:val="17"/>
+              </w:rPr>
+              <w:t>Sesiones 17-18</w:t>
+            </w:r>
+          </w:p>
+        </w:tc>
+        <w:tc>
+          <w:tcPr>
+            <w:tcW w:type="dxa" w:w="1872"/>
+            <w:shd w:fill="F7FAFC"/>
+            <w:tcMar>
+              <w:top w:w="55" w:type="dxa"/>
+              <w:bottom w:w="55" w:type="dxa"/>
+              <w:left w:w="65" w:type="dxa"/>
+              <w:right w:w="65" w:type="dxa"/>
+            </w:tcMar>
+          </w:tcPr>
+          <w:p>
+            <w:pPr>
+              <w:spacing w:before="0" w:after="0" w:line="276" w:lineRule="auto"/>
+            </w:pPr>
+            <w:r>
+              <w:rPr>
+                <w:rFonts w:ascii="Calibri" w:hAnsi="Calibri"/>
+                <w:color w:val="1A202C"/>
+                <w:sz w:val="17"/>
+              </w:rPr>
+              <w:t>Comparativa de aplicabilidad entre PCI DSS, ISO 27001, HIPAA y SOC 1/2.</w:t>
+            </w:r>
+          </w:p>
+        </w:tc>
+      </w:tr>
+      <w:tr>
+        <w:tc>
+          <w:tcPr>
+            <w:tcW w:type="dxa" w:w="1872"/>
+            <w:tcMar>
+              <w:top w:w="55" w:type="dxa"/>
+              <w:bottom w:w="55" w:type="dxa"/>
+              <w:left w:w="65" w:type="dxa"/>
+              <w:right w:w="65" w:type="dxa"/>
+            </w:tcMar>
+          </w:tcPr>
+          <w:p>
+            <w:pPr>
+              <w:spacing w:before="0" w:after="0" w:line="276" w:lineRule="auto"/>
+            </w:pPr>
+            <w:r>
+              <w:rPr>
+                <w:rFonts w:ascii="Calibri" w:hAnsi="Calibri"/>
+                <w:b/>
+                <w:color w:val="1A202C"/>
+                <w:sz w:val="17"/>
+              </w:rPr>
+              <w:t>Módulo 8</w:t>
+            </w:r>
+          </w:p>
+        </w:tc>
+        <w:tc>
+          <w:tcPr>
+            <w:tcW w:type="dxa" w:w="1872"/>
+            <w:tcMar>
+              <w:top w:w="55" w:type="dxa"/>
+              <w:bottom w:w="55" w:type="dxa"/>
+              <w:left w:w="65" w:type="dxa"/>
+              <w:right w:w="65" w:type="dxa"/>
+            </w:tcMar>
+          </w:tcPr>
+          <w:p>
+            <w:pPr>
+              <w:spacing w:before="0" w:after="0" w:line="276" w:lineRule="auto"/>
+            </w:pPr>
+            <w:r>
+              <w:rPr>
+                <w:rFonts w:ascii="Calibri" w:hAnsi="Calibri"/>
+                <w:color w:val="1A202C"/>
+                <w:sz w:val="17"/>
+              </w:rPr>
+              <w:t>Higiene digital y respuesta inicial a incidentes</w:t>
+            </w:r>
+          </w:p>
+        </w:tc>
+        <w:tc>
+          <w:tcPr>
+            <w:tcW w:type="dxa" w:w="1872"/>
+            <w:tcMar>
+              <w:top w:w="55" w:type="dxa"/>
+              <w:bottom w:w="55" w:type="dxa"/>
+              <w:left w:w="65" w:type="dxa"/>
+              <w:right w:w="65" w:type="dxa"/>
+            </w:tcMar>
+          </w:tcPr>
+          <w:p>
+            <w:pPr>
+              <w:spacing w:before="0" w:after="0" w:line="276" w:lineRule="auto"/>
+            </w:pPr>
+            <w:r>
+              <w:rPr>
+                <w:rFonts w:ascii="Calibri" w:hAnsi="Calibri"/>
+                <w:b/>
+                <w:color w:val="1A202C"/>
+                <w:sz w:val="17"/>
+              </w:rPr>
+              <w:t>8 h</w:t>
+            </w:r>
+          </w:p>
+        </w:tc>
+        <w:tc>
+          <w:tcPr>
+            <w:tcW w:type="dxa" w:w="1872"/>
+            <w:tcMar>
+              <w:top w:w="55" w:type="dxa"/>
+              <w:bottom w:w="55" w:type="dxa"/>
+              <w:left w:w="65" w:type="dxa"/>
+              <w:right w:w="65" w:type="dxa"/>
+            </w:tcMar>
+          </w:tcPr>
+          <w:p>
+            <w:pPr>
+              <w:spacing w:before="0" w:after="0" w:line="276" w:lineRule="auto"/>
+            </w:pPr>
+            <w:r>
+              <w:rPr>
+                <w:rFonts w:ascii="Calibri" w:hAnsi="Calibri"/>
+                <w:color w:val="1A202C"/>
+                <w:sz w:val="17"/>
+              </w:rPr>
+              <w:t>Sesiones 19-20</w:t>
+            </w:r>
+          </w:p>
+        </w:tc>
+        <w:tc>
+          <w:tcPr>
+            <w:tcW w:type="dxa" w:w="1872"/>
+            <w:tcMar>
+              <w:top w:w="55" w:type="dxa"/>
+              <w:bottom w:w="55" w:type="dxa"/>
+              <w:left w:w="65" w:type="dxa"/>
+              <w:right w:w="65" w:type="dxa"/>
+            </w:tcMar>
+          </w:tcPr>
+          <w:p>
+            <w:pPr>
+              <w:spacing w:before="0" w:after="0" w:line="276" w:lineRule="auto"/>
+            </w:pPr>
+            <w:r>
+              <w:rPr>
+                <w:rFonts w:ascii="Calibri" w:hAnsi="Calibri"/>
+                <w:color w:val="1A202C"/>
+                <w:sz w:val="17"/>
+              </w:rPr>
+              <w:t>Reporte de phishing, preservación y sustentación del Expediente de Seguridad.</w:t>
             </w:r>
           </w:p>
         </w:tc>
       </w:tr>
     </w:tbl>
-    <w:p>
-      <w:pPr>
-        <w:spacing w:before="80" w:after="240" w:line="276" w:lineRule="auto"/>
-      </w:pPr>
-      <w:r>
-        <w:rPr>
-          <w:rFonts w:ascii="Calibri" w:hAnsi="Calibri"/>
-          <w:i/>
-          <w:color w:val="4A5568"/>
-          <w:sz w:val="17"/>
-        </w:rPr>
-        <w:t>* Las 4h presenciales del Módulo 1 y las 4h presenciales del Módulo 2 se integran en el Sábado Presencial 1 (8 horas de taller en Kinal).</w:t>
-        <w:br/>
-        <w:t>** Las 4h presenciales del Módulo 4 y las 4h presenciales del Módulo 5 se integran en el Sábado Presencial 2 (8 horas de taller y Capstone en Kinal).</w:t>
-      </w:r>
-    </w:p>
     <w:p>
       <w:pPr>
         <w:keepNext/>
@@ -2152,7 +2501,7 @@
           <w:color w:val="003366"/>
           <w:sz w:val="30"/>
         </w:rPr>
-        <w:t>6. Ecosistema de Herramientas Open Source y Cisco (Precios y Licenciamiento)</w:t>
+        <w:t>6. Esquema de Evaluación Institucional y Expediente del Caso</w:t>
       </w:r>
     </w:p>
     <w:p>
@@ -2165,7 +2514,7 @@
           <w:color w:val="1A202C"/>
           <w:sz w:val="20"/>
         </w:rPr>
-        <w:t>El curso optimiza la inversión institucional utilizando un 90% de herramientas Open Source de nivel corporativo, articuladas con la membresía gratuita de Fundación Kinal como Cisco Networking Academy:</w:t>
+        <w:t>El sistema de evaluación exige explicar por qué se propone cada control y cómo se comprobaría su resultado operativo. Conforme a las normas de Fundación Kinal, la nota mínima de suficiencia técnica es de 75 puntos sobre 100:</w:t>
       </w:r>
     </w:p>
     <w:tbl>
@@ -2184,854 +2533,9 @@
         </w:tblBorders>
       </w:tblPr>
       <w:tblGrid>
-        <w:gridCol w:w="2592"/>
-        <w:gridCol w:w="2160"/>
-        <w:gridCol w:w="2016"/>
-        <w:gridCol w:w="2592"/>
-      </w:tblGrid>
-      <w:tr>
-        <w:tc>
-          <w:tcPr>
-            <w:tcW w:type="dxa" w:w="2340"/>
-            <w:shd w:fill="003366"/>
-          </w:tcPr>
-          <w:p>
-            <w:pPr>
-              <w:spacing w:before="0" w:after="0" w:line="276" w:lineRule="auto"/>
-            </w:pPr>
-            <w:r>
-              <w:rPr>
-                <w:rFonts w:ascii="Calibri" w:hAnsi="Calibri"/>
-                <w:b/>
-                <w:color w:val="FFFFFF"/>
-                <w:sz w:val="18"/>
-              </w:rPr>
-              <w:t>Herramienta Tecnológica</w:t>
-            </w:r>
-          </w:p>
-        </w:tc>
-        <w:tc>
-          <w:tcPr>
-            <w:tcW w:type="dxa" w:w="2340"/>
-            <w:shd w:fill="003366"/>
-          </w:tcPr>
-          <w:p>
-            <w:pPr>
-              <w:spacing w:before="0" w:after="0" w:line="276" w:lineRule="auto"/>
-            </w:pPr>
-            <w:r>
-              <w:rPr>
-                <w:rFonts w:ascii="Calibri" w:hAnsi="Calibri"/>
-                <w:b/>
-                <w:color w:val="FFFFFF"/>
-                <w:sz w:val="18"/>
-              </w:rPr>
-              <w:t>Tipo / Licencia</w:t>
-            </w:r>
-          </w:p>
-        </w:tc>
-        <w:tc>
-          <w:tcPr>
-            <w:tcW w:type="dxa" w:w="2340"/>
-            <w:shd w:fill="003366"/>
-          </w:tcPr>
-          <w:p>
-            <w:pPr>
-              <w:spacing w:before="0" w:after="0" w:line="276" w:lineRule="auto"/>
-            </w:pPr>
-            <w:r>
-              <w:rPr>
-                <w:rFonts w:ascii="Calibri" w:hAnsi="Calibri"/>
-                <w:b/>
-                <w:color w:val="FFFFFF"/>
-                <w:sz w:val="18"/>
-              </w:rPr>
-              <w:t>Costo Mensual / Anual</w:t>
-            </w:r>
-          </w:p>
-        </w:tc>
-        <w:tc>
-          <w:tcPr>
-            <w:tcW w:type="dxa" w:w="2340"/>
-            <w:shd w:fill="003366"/>
-          </w:tcPr>
-          <w:p>
-            <w:pPr>
-              <w:spacing w:before="0" w:after="0" w:line="276" w:lineRule="auto"/>
-            </w:pPr>
-            <w:r>
-              <w:rPr>
-                <w:rFonts w:ascii="Calibri" w:hAnsi="Calibri"/>
-                <w:b/>
-                <w:color w:val="FFFFFF"/>
-                <w:sz w:val="18"/>
-              </w:rPr>
-              <w:t>Función en el Programa</w:t>
-            </w:r>
-          </w:p>
-        </w:tc>
-      </w:tr>
-      <w:tr>
-        <w:tc>
-          <w:tcPr>
-            <w:tcW w:type="dxa" w:w="2340"/>
-            <w:shd w:fill="F7FAFC"/>
-            <w:tcMar>
-              <w:top w:w="60" w:type="dxa"/>
-              <w:bottom w:w="60" w:type="dxa"/>
-              <w:left w:w="70" w:type="dxa"/>
-              <w:right w:w="70" w:type="dxa"/>
-            </w:tcMar>
-          </w:tcPr>
-          <w:p>
-            <w:pPr>
-              <w:spacing w:before="0" w:after="0" w:line="276" w:lineRule="auto"/>
-            </w:pPr>
-            <w:r>
-              <w:rPr>
-                <w:rFonts w:ascii="Calibri" w:hAnsi="Calibri"/>
-                <w:b/>
-                <w:color w:val="1A202C"/>
-                <w:sz w:val="17"/>
-              </w:rPr>
-              <w:t>Wazuh SIEM &amp; XDR</w:t>
-            </w:r>
-          </w:p>
-        </w:tc>
-        <w:tc>
-          <w:tcPr>
-            <w:tcW w:type="dxa" w:w="2340"/>
-            <w:shd w:fill="F7FAFC"/>
-            <w:tcMar>
-              <w:top w:w="60" w:type="dxa"/>
-              <w:bottom w:w="60" w:type="dxa"/>
-              <w:left w:w="70" w:type="dxa"/>
-              <w:right w:w="70" w:type="dxa"/>
-            </w:tcMar>
-          </w:tcPr>
-          <w:p>
-            <w:pPr>
-              <w:spacing w:before="0" w:after="0" w:line="276" w:lineRule="auto"/>
-            </w:pPr>
-            <w:r>
-              <w:rPr>
-                <w:rFonts w:ascii="Calibri" w:hAnsi="Calibri"/>
-                <w:color w:val="1A202C"/>
-                <w:sz w:val="17"/>
-              </w:rPr>
-              <w:t>Open Source (GPL)</w:t>
-            </w:r>
-          </w:p>
-        </w:tc>
-        <w:tc>
-          <w:tcPr>
-            <w:tcW w:type="dxa" w:w="2340"/>
-            <w:shd w:fill="F7FAFC"/>
-            <w:tcMar>
-              <w:top w:w="60" w:type="dxa"/>
-              <w:bottom w:w="60" w:type="dxa"/>
-              <w:left w:w="70" w:type="dxa"/>
-              <w:right w:w="70" w:type="dxa"/>
-            </w:tcMar>
-          </w:tcPr>
-          <w:p>
-            <w:pPr>
-              <w:spacing w:before="0" w:after="0" w:line="276" w:lineRule="auto"/>
-            </w:pPr>
-            <w:r>
-              <w:rPr>
-                <w:rFonts w:ascii="Calibri" w:hAnsi="Calibri"/>
-                <w:color w:val="1A202C"/>
-                <w:sz w:val="17"/>
-              </w:rPr>
-              <w:t>$0.00 / mes (Gratuito)</w:t>
-            </w:r>
-          </w:p>
-        </w:tc>
-        <w:tc>
-          <w:tcPr>
-            <w:tcW w:type="dxa" w:w="2340"/>
-            <w:shd w:fill="F7FAFC"/>
-            <w:tcMar>
-              <w:top w:w="60" w:type="dxa"/>
-              <w:bottom w:w="60" w:type="dxa"/>
-              <w:left w:w="70" w:type="dxa"/>
-              <w:right w:w="70" w:type="dxa"/>
-            </w:tcMar>
-          </w:tcPr>
-          <w:p>
-            <w:pPr>
-              <w:spacing w:before="0" w:after="0" w:line="276" w:lineRule="auto"/>
-            </w:pPr>
-            <w:r>
-              <w:rPr>
-                <w:rFonts w:ascii="Calibri" w:hAnsi="Calibri"/>
-                <w:color w:val="1A202C"/>
-                <w:sz w:val="17"/>
-              </w:rPr>
-              <w:t>Recolección de logs, correlación y triaje de alertas de seguridad</w:t>
-            </w:r>
-          </w:p>
-        </w:tc>
-      </w:tr>
-      <w:tr>
-        <w:tc>
-          <w:tcPr>
-            <w:tcW w:type="dxa" w:w="2340"/>
-            <w:tcMar>
-              <w:top w:w="60" w:type="dxa"/>
-              <w:bottom w:w="60" w:type="dxa"/>
-              <w:left w:w="70" w:type="dxa"/>
-              <w:right w:w="70" w:type="dxa"/>
-            </w:tcMar>
-          </w:tcPr>
-          <w:p>
-            <w:pPr>
-              <w:spacing w:before="0" w:after="0" w:line="276" w:lineRule="auto"/>
-            </w:pPr>
-            <w:r>
-              <w:rPr>
-                <w:rFonts w:ascii="Calibri" w:hAnsi="Calibri"/>
-                <w:b/>
-                <w:color w:val="1A202C"/>
-                <w:sz w:val="17"/>
-              </w:rPr>
-              <w:t>Wireshark &amp; tcpdump</w:t>
-            </w:r>
-          </w:p>
-        </w:tc>
-        <w:tc>
-          <w:tcPr>
-            <w:tcW w:type="dxa" w:w="2340"/>
-            <w:tcMar>
-              <w:top w:w="60" w:type="dxa"/>
-              <w:bottom w:w="60" w:type="dxa"/>
-              <w:left w:w="70" w:type="dxa"/>
-              <w:right w:w="70" w:type="dxa"/>
-            </w:tcMar>
-          </w:tcPr>
-          <w:p>
-            <w:pPr>
-              <w:spacing w:before="0" w:after="0" w:line="276" w:lineRule="auto"/>
-            </w:pPr>
-            <w:r>
-              <w:rPr>
-                <w:rFonts w:ascii="Calibri" w:hAnsi="Calibri"/>
-                <w:color w:val="1A202C"/>
-                <w:sz w:val="17"/>
-              </w:rPr>
-              <w:t>Open Source (GPL)</w:t>
-            </w:r>
-          </w:p>
-        </w:tc>
-        <w:tc>
-          <w:tcPr>
-            <w:tcW w:type="dxa" w:w="2340"/>
-            <w:tcMar>
-              <w:top w:w="60" w:type="dxa"/>
-              <w:bottom w:w="60" w:type="dxa"/>
-              <w:left w:w="70" w:type="dxa"/>
-              <w:right w:w="70" w:type="dxa"/>
-            </w:tcMar>
-          </w:tcPr>
-          <w:p>
-            <w:pPr>
-              <w:spacing w:before="0" w:after="0" w:line="276" w:lineRule="auto"/>
-            </w:pPr>
-            <w:r>
-              <w:rPr>
-                <w:rFonts w:ascii="Calibri" w:hAnsi="Calibri"/>
-                <w:color w:val="1A202C"/>
-                <w:sz w:val="17"/>
-              </w:rPr>
-              <w:t>$0.00 / mes (Gratuito)</w:t>
-            </w:r>
-          </w:p>
-        </w:tc>
-        <w:tc>
-          <w:tcPr>
-            <w:tcW w:type="dxa" w:w="2340"/>
-            <w:tcMar>
-              <w:top w:w="60" w:type="dxa"/>
-              <w:bottom w:w="60" w:type="dxa"/>
-              <w:left w:w="70" w:type="dxa"/>
-              <w:right w:w="70" w:type="dxa"/>
-            </w:tcMar>
-          </w:tcPr>
-          <w:p>
-            <w:pPr>
-              <w:spacing w:before="0" w:after="0" w:line="276" w:lineRule="auto"/>
-            </w:pPr>
-            <w:r>
-              <w:rPr>
-                <w:rFonts w:ascii="Calibri" w:hAnsi="Calibri"/>
-                <w:color w:val="1A202C"/>
-                <w:sz w:val="17"/>
-              </w:rPr>
-              <w:t>Inspección profunda de paquetes y auditoría de protocolos de red</w:t>
-            </w:r>
-          </w:p>
-        </w:tc>
-      </w:tr>
-      <w:tr>
-        <w:tc>
-          <w:tcPr>
-            <w:tcW w:type="dxa" w:w="2340"/>
-            <w:shd w:fill="F7FAFC"/>
-            <w:tcMar>
-              <w:top w:w="60" w:type="dxa"/>
-              <w:bottom w:w="60" w:type="dxa"/>
-              <w:left w:w="70" w:type="dxa"/>
-              <w:right w:w="70" w:type="dxa"/>
-            </w:tcMar>
-          </w:tcPr>
-          <w:p>
-            <w:pPr>
-              <w:spacing w:before="0" w:after="0" w:line="276" w:lineRule="auto"/>
-            </w:pPr>
-            <w:r>
-              <w:rPr>
-                <w:rFonts w:ascii="Calibri" w:hAnsi="Calibri"/>
-                <w:b/>
-                <w:color w:val="1A202C"/>
-                <w:sz w:val="17"/>
-              </w:rPr>
-              <w:t>Greenbone (OpenVAS)</w:t>
-            </w:r>
-          </w:p>
-        </w:tc>
-        <w:tc>
-          <w:tcPr>
-            <w:tcW w:type="dxa" w:w="2340"/>
-            <w:shd w:fill="F7FAFC"/>
-            <w:tcMar>
-              <w:top w:w="60" w:type="dxa"/>
-              <w:bottom w:w="60" w:type="dxa"/>
-              <w:left w:w="70" w:type="dxa"/>
-              <w:right w:w="70" w:type="dxa"/>
-            </w:tcMar>
-          </w:tcPr>
-          <w:p>
-            <w:pPr>
-              <w:spacing w:before="0" w:after="0" w:line="276" w:lineRule="auto"/>
-            </w:pPr>
-            <w:r>
-              <w:rPr>
-                <w:rFonts w:ascii="Calibri" w:hAnsi="Calibri"/>
-                <w:color w:val="1A202C"/>
-                <w:sz w:val="17"/>
-              </w:rPr>
-              <w:t>Open Source</w:t>
-            </w:r>
-          </w:p>
-        </w:tc>
-        <w:tc>
-          <w:tcPr>
-            <w:tcW w:type="dxa" w:w="2340"/>
-            <w:shd w:fill="F7FAFC"/>
-            <w:tcMar>
-              <w:top w:w="60" w:type="dxa"/>
-              <w:bottom w:w="60" w:type="dxa"/>
-              <w:left w:w="70" w:type="dxa"/>
-              <w:right w:w="70" w:type="dxa"/>
-            </w:tcMar>
-          </w:tcPr>
-          <w:p>
-            <w:pPr>
-              <w:spacing w:before="0" w:after="0" w:line="276" w:lineRule="auto"/>
-            </w:pPr>
-            <w:r>
-              <w:rPr>
-                <w:rFonts w:ascii="Calibri" w:hAnsi="Calibri"/>
-                <w:color w:val="1A202C"/>
-                <w:sz w:val="17"/>
-              </w:rPr>
-              <w:t>$0.00 / mes (Gratuito)</w:t>
-            </w:r>
-          </w:p>
-        </w:tc>
-        <w:tc>
-          <w:tcPr>
-            <w:tcW w:type="dxa" w:w="2340"/>
-            <w:shd w:fill="F7FAFC"/>
-            <w:tcMar>
-              <w:top w:w="60" w:type="dxa"/>
-              <w:bottom w:w="60" w:type="dxa"/>
-              <w:left w:w="70" w:type="dxa"/>
-              <w:right w:w="70" w:type="dxa"/>
-            </w:tcMar>
-          </w:tcPr>
-          <w:p>
-            <w:pPr>
-              <w:spacing w:before="0" w:after="0" w:line="276" w:lineRule="auto"/>
-            </w:pPr>
-            <w:r>
-              <w:rPr>
-                <w:rFonts w:ascii="Calibri" w:hAnsi="Calibri"/>
-                <w:color w:val="1A202C"/>
-                <w:sz w:val="17"/>
-              </w:rPr>
-              <w:t>Escaneo de vulnerabilidades y evaluación de parches de seguridad</w:t>
-            </w:r>
-          </w:p>
-        </w:tc>
-      </w:tr>
-      <w:tr>
-        <w:tc>
-          <w:tcPr>
-            <w:tcW w:type="dxa" w:w="2340"/>
-            <w:tcMar>
-              <w:top w:w="60" w:type="dxa"/>
-              <w:bottom w:w="60" w:type="dxa"/>
-              <w:left w:w="70" w:type="dxa"/>
-              <w:right w:w="70" w:type="dxa"/>
-            </w:tcMar>
-          </w:tcPr>
-          <w:p>
-            <w:pPr>
-              <w:spacing w:before="0" w:after="0" w:line="276" w:lineRule="auto"/>
-            </w:pPr>
-            <w:r>
-              <w:rPr>
-                <w:rFonts w:ascii="Calibri" w:hAnsi="Calibri"/>
-                <w:b/>
-                <w:color w:val="1A202C"/>
-                <w:sz w:val="17"/>
-              </w:rPr>
-              <w:t>Oracle VirtualBox / VMs</w:t>
-            </w:r>
-          </w:p>
-        </w:tc>
-        <w:tc>
-          <w:tcPr>
-            <w:tcW w:type="dxa" w:w="2340"/>
-            <w:tcMar>
-              <w:top w:w="60" w:type="dxa"/>
-              <w:bottom w:w="60" w:type="dxa"/>
-              <w:left w:w="70" w:type="dxa"/>
-              <w:right w:w="70" w:type="dxa"/>
-            </w:tcMar>
-          </w:tcPr>
-          <w:p>
-            <w:pPr>
-              <w:spacing w:before="0" w:after="0" w:line="276" w:lineRule="auto"/>
-            </w:pPr>
-            <w:r>
-              <w:rPr>
-                <w:rFonts w:ascii="Calibri" w:hAnsi="Calibri"/>
-                <w:color w:val="1A202C"/>
-                <w:sz w:val="17"/>
-              </w:rPr>
-              <w:t>Open Source (GPL)</w:t>
-            </w:r>
-          </w:p>
-        </w:tc>
-        <w:tc>
-          <w:tcPr>
-            <w:tcW w:type="dxa" w:w="2340"/>
-            <w:tcMar>
-              <w:top w:w="60" w:type="dxa"/>
-              <w:bottom w:w="60" w:type="dxa"/>
-              <w:left w:w="70" w:type="dxa"/>
-              <w:right w:w="70" w:type="dxa"/>
-            </w:tcMar>
-          </w:tcPr>
-          <w:p>
-            <w:pPr>
-              <w:spacing w:before="0" w:after="0" w:line="276" w:lineRule="auto"/>
-            </w:pPr>
-            <w:r>
-              <w:rPr>
-                <w:rFonts w:ascii="Calibri" w:hAnsi="Calibri"/>
-                <w:color w:val="1A202C"/>
-                <w:sz w:val="17"/>
-              </w:rPr>
-              <w:t>$0.00 / mes (Gratuito)</w:t>
-            </w:r>
-          </w:p>
-        </w:tc>
-        <w:tc>
-          <w:tcPr>
-            <w:tcW w:type="dxa" w:w="2340"/>
-            <w:tcMar>
-              <w:top w:w="60" w:type="dxa"/>
-              <w:bottom w:w="60" w:type="dxa"/>
-              <w:left w:w="70" w:type="dxa"/>
-              <w:right w:w="70" w:type="dxa"/>
-            </w:tcMar>
-          </w:tcPr>
-          <w:p>
-            <w:pPr>
-              <w:spacing w:before="0" w:after="0" w:line="276" w:lineRule="auto"/>
-            </w:pPr>
-            <w:r>
-              <w:rPr>
-                <w:rFonts w:ascii="Calibri" w:hAnsi="Calibri"/>
-                <w:color w:val="1A202C"/>
-                <w:sz w:val="17"/>
-              </w:rPr>
-              <w:t>Montaje de laboratorios virtuales aislados (Kali, Ubuntu, Windows)</w:t>
-            </w:r>
-          </w:p>
-        </w:tc>
-      </w:tr>
-      <w:tr>
-        <w:tc>
-          <w:tcPr>
-            <w:tcW w:type="dxa" w:w="2340"/>
-            <w:shd w:fill="F7FAFC"/>
-            <w:tcMar>
-              <w:top w:w="60" w:type="dxa"/>
-              <w:bottom w:w="60" w:type="dxa"/>
-              <w:left w:w="70" w:type="dxa"/>
-              <w:right w:w="70" w:type="dxa"/>
-            </w:tcMar>
-          </w:tcPr>
-          <w:p>
-            <w:pPr>
-              <w:spacing w:before="0" w:after="0" w:line="276" w:lineRule="auto"/>
-            </w:pPr>
-            <w:r>
-              <w:rPr>
-                <w:rFonts w:ascii="Calibri" w:hAnsi="Calibri"/>
-                <w:b/>
-                <w:color w:val="1A202C"/>
-                <w:sz w:val="17"/>
-              </w:rPr>
-              <w:t>Cisco Packet Tracer</w:t>
-            </w:r>
-          </w:p>
-        </w:tc>
-        <w:tc>
-          <w:tcPr>
-            <w:tcW w:type="dxa" w:w="2340"/>
-            <w:shd w:fill="F7FAFC"/>
-            <w:tcMar>
-              <w:top w:w="60" w:type="dxa"/>
-              <w:bottom w:w="60" w:type="dxa"/>
-              <w:left w:w="70" w:type="dxa"/>
-              <w:right w:w="70" w:type="dxa"/>
-            </w:tcMar>
-          </w:tcPr>
-          <w:p>
-            <w:pPr>
-              <w:spacing w:before="0" w:after="0" w:line="276" w:lineRule="auto"/>
-            </w:pPr>
-            <w:r>
-              <w:rPr>
-                <w:rFonts w:ascii="Calibri" w:hAnsi="Calibri"/>
-                <w:color w:val="1A202C"/>
-                <w:sz w:val="17"/>
-              </w:rPr>
-              <w:t>Cisco NetAcad</w:t>
-            </w:r>
-          </w:p>
-        </w:tc>
-        <w:tc>
-          <w:tcPr>
-            <w:tcW w:type="dxa" w:w="2340"/>
-            <w:shd w:fill="F7FAFC"/>
-            <w:tcMar>
-              <w:top w:w="60" w:type="dxa"/>
-              <w:bottom w:w="60" w:type="dxa"/>
-              <w:left w:w="70" w:type="dxa"/>
-              <w:right w:w="70" w:type="dxa"/>
-            </w:tcMar>
-          </w:tcPr>
-          <w:p>
-            <w:pPr>
-              <w:spacing w:before="0" w:after="0" w:line="276" w:lineRule="auto"/>
-            </w:pPr>
-            <w:r>
-              <w:rPr>
-                <w:rFonts w:ascii="Calibri" w:hAnsi="Calibri"/>
-                <w:color w:val="1A202C"/>
-                <w:sz w:val="17"/>
-              </w:rPr>
-              <w:t>$0.00 / mes (Gratuito)</w:t>
-            </w:r>
-          </w:p>
-        </w:tc>
-        <w:tc>
-          <w:tcPr>
-            <w:tcW w:type="dxa" w:w="2340"/>
-            <w:shd w:fill="F7FAFC"/>
-            <w:tcMar>
-              <w:top w:w="60" w:type="dxa"/>
-              <w:bottom w:w="60" w:type="dxa"/>
-              <w:left w:w="70" w:type="dxa"/>
-              <w:right w:w="70" w:type="dxa"/>
-            </w:tcMar>
-          </w:tcPr>
-          <w:p>
-            <w:pPr>
-              <w:spacing w:before="0" w:after="0" w:line="276" w:lineRule="auto"/>
-            </w:pPr>
-            <w:r>
-              <w:rPr>
-                <w:rFonts w:ascii="Calibri" w:hAnsi="Calibri"/>
-                <w:color w:val="1A202C"/>
-                <w:sz w:val="17"/>
-              </w:rPr>
-              <w:t>Simulación de topologías de red, switches, routers y firewalls ASA</w:t>
-            </w:r>
-          </w:p>
-        </w:tc>
-      </w:tr>
-      <w:tr>
-        <w:tc>
-          <w:tcPr>
-            <w:tcW w:type="dxa" w:w="2340"/>
-            <w:tcMar>
-              <w:top w:w="60" w:type="dxa"/>
-              <w:bottom w:w="60" w:type="dxa"/>
-              <w:left w:w="70" w:type="dxa"/>
-              <w:right w:w="70" w:type="dxa"/>
-            </w:tcMar>
-          </w:tcPr>
-          <w:p>
-            <w:pPr>
-              <w:spacing w:before="0" w:after="0" w:line="276" w:lineRule="auto"/>
-            </w:pPr>
-            <w:r>
-              <w:rPr>
-                <w:rFonts w:ascii="Calibri" w:hAnsi="Calibri"/>
-                <w:b/>
-                <w:color w:val="1A202C"/>
-                <w:sz w:val="17"/>
-              </w:rPr>
-              <w:t>Cisco Snort IDS/IPS</w:t>
-            </w:r>
-          </w:p>
-        </w:tc>
-        <w:tc>
-          <w:tcPr>
-            <w:tcW w:type="dxa" w:w="2340"/>
-            <w:tcMar>
-              <w:top w:w="60" w:type="dxa"/>
-              <w:bottom w:w="60" w:type="dxa"/>
-              <w:left w:w="70" w:type="dxa"/>
-              <w:right w:w="70" w:type="dxa"/>
-            </w:tcMar>
-          </w:tcPr>
-          <w:p>
-            <w:pPr>
-              <w:spacing w:before="0" w:after="0" w:line="276" w:lineRule="auto"/>
-            </w:pPr>
-            <w:r>
-              <w:rPr>
-                <w:rFonts w:ascii="Calibri" w:hAnsi="Calibri"/>
-                <w:color w:val="1A202C"/>
-                <w:sz w:val="17"/>
-              </w:rPr>
-              <w:t>Cisco Talos (GPL)</w:t>
-            </w:r>
-          </w:p>
-        </w:tc>
-        <w:tc>
-          <w:tcPr>
-            <w:tcW w:type="dxa" w:w="2340"/>
-            <w:tcMar>
-              <w:top w:w="60" w:type="dxa"/>
-              <w:bottom w:w="60" w:type="dxa"/>
-              <w:left w:w="70" w:type="dxa"/>
-              <w:right w:w="70" w:type="dxa"/>
-            </w:tcMar>
-          </w:tcPr>
-          <w:p>
-            <w:pPr>
-              <w:spacing w:before="0" w:after="0" w:line="276" w:lineRule="auto"/>
-            </w:pPr>
-            <w:r>
-              <w:rPr>
-                <w:rFonts w:ascii="Calibri" w:hAnsi="Calibri"/>
-                <w:color w:val="1A202C"/>
-                <w:sz w:val="17"/>
-              </w:rPr>
-              <w:t>$0.00 / mes (Gratuito)</w:t>
-            </w:r>
-          </w:p>
-        </w:tc>
-        <w:tc>
-          <w:tcPr>
-            <w:tcW w:type="dxa" w:w="2340"/>
-            <w:tcMar>
-              <w:top w:w="60" w:type="dxa"/>
-              <w:bottom w:w="60" w:type="dxa"/>
-              <w:left w:w="70" w:type="dxa"/>
-              <w:right w:w="70" w:type="dxa"/>
-            </w:tcMar>
-          </w:tcPr>
-          <w:p>
-            <w:pPr>
-              <w:spacing w:before="0" w:after="0" w:line="276" w:lineRule="auto"/>
-            </w:pPr>
-            <w:r>
-              <w:rPr>
-                <w:rFonts w:ascii="Calibri" w:hAnsi="Calibri"/>
-                <w:color w:val="1A202C"/>
-                <w:sz w:val="17"/>
-              </w:rPr>
-              <w:t>Detección de intrusiones basada en firmas de tráfico de red</w:t>
-            </w:r>
-          </w:p>
-        </w:tc>
-      </w:tr>
-      <w:tr>
-        <w:tc>
-          <w:tcPr>
-            <w:tcW w:type="dxa" w:w="2340"/>
-            <w:shd w:fill="F7FAFC"/>
-            <w:tcMar>
-              <w:top w:w="60" w:type="dxa"/>
-              <w:bottom w:w="60" w:type="dxa"/>
-              <w:left w:w="70" w:type="dxa"/>
-              <w:right w:w="70" w:type="dxa"/>
-            </w:tcMar>
-          </w:tcPr>
-          <w:p>
-            <w:pPr>
-              <w:spacing w:before="0" w:after="0" w:line="276" w:lineRule="auto"/>
-            </w:pPr>
-            <w:r>
-              <w:rPr>
-                <w:rFonts w:ascii="Calibri" w:hAnsi="Calibri"/>
-                <w:b/>
-                <w:color w:val="1A202C"/>
-                <w:sz w:val="17"/>
-              </w:rPr>
-              <w:t>Cisco Modeling Labs (CML)</w:t>
-              <w:br/>
-              <w:t>[Herramienta Opcional]</w:t>
-            </w:r>
-          </w:p>
-        </w:tc>
-        <w:tc>
-          <w:tcPr>
-            <w:tcW w:type="dxa" w:w="2340"/>
-            <w:shd w:fill="F7FAFC"/>
-            <w:tcMar>
-              <w:top w:w="60" w:type="dxa"/>
-              <w:bottom w:w="60" w:type="dxa"/>
-              <w:left w:w="70" w:type="dxa"/>
-              <w:right w:w="70" w:type="dxa"/>
-            </w:tcMar>
-          </w:tcPr>
-          <w:p>
-            <w:pPr>
-              <w:spacing w:before="0" w:after="0" w:line="276" w:lineRule="auto"/>
-            </w:pPr>
-            <w:r>
-              <w:rPr>
-                <w:rFonts w:ascii="Calibri" w:hAnsi="Calibri"/>
-                <w:color w:val="1A202C"/>
-                <w:sz w:val="17"/>
-              </w:rPr>
-              <w:t>Cisco Comercial</w:t>
-            </w:r>
-          </w:p>
-        </w:tc>
-        <w:tc>
-          <w:tcPr>
-            <w:tcW w:type="dxa" w:w="2340"/>
-            <w:shd w:fill="F7FAFC"/>
-            <w:tcMar>
-              <w:top w:w="60" w:type="dxa"/>
-              <w:bottom w:w="60" w:type="dxa"/>
-              <w:left w:w="70" w:type="dxa"/>
-              <w:right w:w="70" w:type="dxa"/>
-            </w:tcMar>
-          </w:tcPr>
-          <w:p>
-            <w:pPr>
-              <w:spacing w:before="0" w:after="0" w:line="276" w:lineRule="auto"/>
-            </w:pPr>
-            <w:r>
-              <w:rPr>
-                <w:rFonts w:ascii="Calibri" w:hAnsi="Calibri"/>
-                <w:color w:val="1A202C"/>
-                <w:sz w:val="17"/>
-              </w:rPr>
-              <w:t>$199.00 USD / año</w:t>
-              <w:br/>
-              <w:t>(~$16.58 USD / mes)</w:t>
-            </w:r>
-          </w:p>
-        </w:tc>
-        <w:tc>
-          <w:tcPr>
-            <w:tcW w:type="dxa" w:w="2340"/>
-            <w:shd w:fill="F7FAFC"/>
-            <w:tcMar>
-              <w:top w:w="60" w:type="dxa"/>
-              <w:bottom w:w="60" w:type="dxa"/>
-              <w:left w:w="70" w:type="dxa"/>
-              <w:right w:w="70" w:type="dxa"/>
-            </w:tcMar>
-          </w:tcPr>
-          <w:p>
-            <w:pPr>
-              <w:spacing w:before="0" w:after="0" w:line="276" w:lineRule="auto"/>
-            </w:pPr>
-            <w:r>
-              <w:rPr>
-                <w:rFonts w:ascii="Calibri" w:hAnsi="Calibri"/>
-                <w:color w:val="1A202C"/>
-                <w:sz w:val="17"/>
-              </w:rPr>
-              <w:t>Emulación avanzada para instructor (no requerida para alumnos)</w:t>
-            </w:r>
-          </w:p>
-        </w:tc>
-      </w:tr>
-    </w:tbl>
-    <w:p>
-      <w:pPr>
-        <w:keepNext/>
-        <w:spacing w:before="320" w:after="120"/>
-      </w:pPr>
-      <w:r>
-        <w:rPr>
-          <w:rFonts w:ascii="Calibri" w:hAnsi="Calibri"/>
-          <w:b/>
-          <w:color w:val="003366"/>
-          <w:sz w:val="30"/>
-        </w:rPr>
-        <w:t>7. Esquema de Evaluación y Acreditación (Umbral ≥ 75 Puntos)</w:t>
-      </w:r>
-    </w:p>
-    <w:p>
-      <w:pPr>
-        <w:spacing w:before="0" w:after="120" w:line="276" w:lineRule="auto"/>
-      </w:pPr>
-      <w:r>
-        <w:rPr>
-          <w:rFonts w:ascii="Calibri" w:hAnsi="Calibri"/>
-          <w:color w:val="1A202C"/>
-          <w:sz w:val="20"/>
-        </w:rPr>
-        <w:t>Para acreditar el curso y obtener el diploma de certificación técnica emitido por Fundación Kinal, el estudiante debe obtener una nota mínima de 75 puntos sobre 100, demostrando solvencia teórica y competencia operativa en incidentes reales:</w:t>
-      </w:r>
-    </w:p>
-    <w:tbl>
-      <w:tblPr>
-        <w:tblW w:type="auto" w:w="0"/>
-        <w:jc w:val="center"/>
-        <w:tblLayout w:type="fixed"/>
-        <w:tblLook w:firstColumn="1" w:firstRow="1" w:lastColumn="0" w:lastRow="0" w:noHBand="0" w:noVBand="1" w:val="04A0"/>
-        <w:tblBorders>
-          <w:top w:val="single" w:sz="4" w:space="0" w:color="CBD5E0"/>
-          <w:bottom w:val="single" w:sz="4" w:space="0" w:color="CBD5E0"/>
-          <w:insideH w:val="single" w:sz="4" w:space="0" w:color="CBD5E0"/>
-          <w:insideV w:val="none"/>
-          <w:left w:val="none"/>
-          <w:right w:val="none"/>
-        </w:tblBorders>
-      </w:tblPr>
-      <w:tblGrid>
-        <w:gridCol w:w="3312"/>
+        <w:gridCol w:w="3168"/>
         <w:gridCol w:w="1584"/>
-        <w:gridCol w:w="4464"/>
+        <w:gridCol w:w="4608"/>
       </w:tblGrid>
       <w:tr>
         <w:tc>
@@ -3050,7 +2554,7 @@
                 <w:color w:val="FFFFFF"/>
                 <w:sz w:val="18"/>
               </w:rPr>
-              <w:t>Rubro Evaluativo</w:t>
+              <w:t>Componente Evaluativo</w:t>
             </w:r>
           </w:p>
         </w:tc>
@@ -3090,7 +2594,7 @@
                 <w:color w:val="FFFFFF"/>
                 <w:sz w:val="18"/>
               </w:rPr>
-              <w:t>Criterio de Suficiencia Técnica (≥ 75 pts)</w:t>
+              <w:t>Evidencia y Criterio de Verificación</w:t>
             </w:r>
           </w:p>
         </w:tc>
@@ -3118,7 +2622,7 @@
                 <w:color w:val="1A202C"/>
                 <w:sz w:val="17"/>
               </w:rPr>
-              <w:t>Proyecto Práctico Módulo 1 (Redes)</w:t>
+              <w:t>Comprobaciones de aprendizaje</w:t>
             </w:r>
           </w:p>
         </w:tc>
@@ -3144,7 +2648,7 @@
                 <w:color w:val="1A202C"/>
                 <w:sz w:val="17"/>
               </w:rPr>
-              <w:t>15%</w:t>
+              <w:t>20%</w:t>
             </w:r>
           </w:p>
         </w:tc>
@@ -3169,7 +2673,7 @@
                 <w:color w:val="1A202C"/>
                 <w:sz w:val="17"/>
               </w:rPr>
-              <w:t>Captura de paquetes en Wireshark y configuración correcta de reglas en firewall</w:t>
+              <w:t>Respuestas breves, interpretación de flujos y defensa de decisiones técnicas.</w:t>
             </w:r>
           </w:p>
         </w:tc>
@@ -3196,7 +2700,7 @@
                 <w:color w:val="1A202C"/>
                 <w:sz w:val="17"/>
               </w:rPr>
-              <w:t>Proyecto Práctico Módulo 2 (Hardening)</w:t>
+              <w:t>Productos de los módulos</w:t>
             </w:r>
           </w:p>
         </w:tc>
@@ -3221,7 +2725,7 @@
                 <w:color w:val="1A202C"/>
                 <w:sz w:val="17"/>
               </w:rPr>
-              <w:t>15%</w:t>
+              <w:t>40%</w:t>
             </w:r>
           </w:p>
         </w:tc>
@@ -3245,7 +2749,7 @@
                 <w:color w:val="1A202C"/>
                 <w:sz w:val="17"/>
               </w:rPr>
-              <w:t>Auditoría LinPEAS sin vulnerabilidades críticas y aplicación de directivas GPO</w:t>
+              <w:t>Diagramas de arquitectura, matrices RBAC, fichas y documentos revisados.</w:t>
             </w:r>
           </w:p>
         </w:tc>
@@ -3273,7 +2777,7 @@
                 <w:color w:val="1A202C"/>
                 <w:sz w:val="17"/>
               </w:rPr>
-              <w:t>Proyecto Práctico Módulo 3 (SIEM)</w:t>
+              <w:t>Proyecto integrador (Expediente)</w:t>
             </w:r>
           </w:p>
         </w:tc>
@@ -3299,7 +2803,7 @@
                 <w:color w:val="1A202C"/>
                 <w:sz w:val="17"/>
               </w:rPr>
-              <w:t>15%</w:t>
+              <w:t>40%</w:t>
             </w:r>
           </w:p>
         </w:tc>
@@ -3324,238 +2828,7 @@
                 <w:color w:val="1A202C"/>
                 <w:sz w:val="17"/>
               </w:rPr>
-              <w:t>Triaje de 5 alertas de seguridad en Wazuh con tickets debidamente documentados</w:t>
-            </w:r>
-          </w:p>
-        </w:tc>
-      </w:tr>
-      <w:tr>
-        <w:tc>
-          <w:tcPr>
-            <w:tcW w:type="dxa" w:w="3120"/>
-            <w:tcMar>
-              <w:top w:w="60" w:type="dxa"/>
-              <w:bottom w:w="60" w:type="dxa"/>
-              <w:left w:w="70" w:type="dxa"/>
-              <w:right w:w="70" w:type="dxa"/>
-            </w:tcMar>
-          </w:tcPr>
-          <w:p>
-            <w:pPr>
-              <w:spacing w:before="0" w:after="0" w:line="276" w:lineRule="auto"/>
-            </w:pPr>
-            <w:r>
-              <w:rPr>
-                <w:rFonts w:ascii="Calibri" w:hAnsi="Calibri"/>
-                <w:b/>
-                <w:color w:val="1A202C"/>
-                <w:sz w:val="17"/>
-              </w:rPr>
-              <w:t>Proyecto Práctico Módulo 4 (Threats)</w:t>
-            </w:r>
-          </w:p>
-        </w:tc>
-        <w:tc>
-          <w:tcPr>
-            <w:tcW w:type="dxa" w:w="3120"/>
-            <w:tcMar>
-              <w:top w:w="60" w:type="dxa"/>
-              <w:bottom w:w="60" w:type="dxa"/>
-              <w:left w:w="70" w:type="dxa"/>
-              <w:right w:w="70" w:type="dxa"/>
-            </w:tcMar>
-          </w:tcPr>
-          <w:p>
-            <w:pPr>
-              <w:spacing w:before="0" w:after="0" w:line="276" w:lineRule="auto"/>
-            </w:pPr>
-            <w:r>
-              <w:rPr>
-                <w:rFonts w:ascii="Calibri" w:hAnsi="Calibri"/>
-                <w:b/>
-                <w:color w:val="1A202C"/>
-                <w:sz w:val="17"/>
-              </w:rPr>
-              <w:t>15%</w:t>
-            </w:r>
-          </w:p>
-        </w:tc>
-        <w:tc>
-          <w:tcPr>
-            <w:tcW w:type="dxa" w:w="3120"/>
-            <w:tcMar>
-              <w:top w:w="60" w:type="dxa"/>
-              <w:bottom w:w="60" w:type="dxa"/>
-              <w:left w:w="70" w:type="dxa"/>
-              <w:right w:w="70" w:type="dxa"/>
-            </w:tcMar>
-          </w:tcPr>
-          <w:p>
-            <w:pPr>
-              <w:spacing w:before="0" w:after="0" w:line="276" w:lineRule="auto"/>
-            </w:pPr>
-            <w:r>
-              <w:rPr>
-                <w:rFonts w:ascii="Calibri" w:hAnsi="Calibri"/>
-                <w:color w:val="1A202C"/>
-                <w:sz w:val="17"/>
-              </w:rPr>
-              <w:t>Análisis de cabeceras de correo phishing y reporte de escaneo de vulnerabilidades</w:t>
-            </w:r>
-          </w:p>
-        </w:tc>
-      </w:tr>
-      <w:tr>
-        <w:tc>
-          <w:tcPr>
-            <w:tcW w:type="dxa" w:w="3120"/>
-            <w:shd w:fill="F7FAFC"/>
-            <w:tcMar>
-              <w:top w:w="60" w:type="dxa"/>
-              <w:bottom w:w="60" w:type="dxa"/>
-              <w:left w:w="70" w:type="dxa"/>
-              <w:right w:w="70" w:type="dxa"/>
-            </w:tcMar>
-          </w:tcPr>
-          <w:p>
-            <w:pPr>
-              <w:spacing w:before="0" w:after="0" w:line="276" w:lineRule="auto"/>
-            </w:pPr>
-            <w:r>
-              <w:rPr>
-                <w:rFonts w:ascii="Calibri" w:hAnsi="Calibri"/>
-                <w:b/>
-                <w:color w:val="1A202C"/>
-                <w:sz w:val="17"/>
-              </w:rPr>
-              <w:t>Proyecto Capstone / CTF (Módulo 5)</w:t>
-            </w:r>
-          </w:p>
-        </w:tc>
-        <w:tc>
-          <w:tcPr>
-            <w:tcW w:type="dxa" w:w="3120"/>
-            <w:shd w:fill="F7FAFC"/>
-            <w:tcMar>
-              <w:top w:w="60" w:type="dxa"/>
-              <w:bottom w:w="60" w:type="dxa"/>
-              <w:left w:w="70" w:type="dxa"/>
-              <w:right w:w="70" w:type="dxa"/>
-            </w:tcMar>
-          </w:tcPr>
-          <w:p>
-            <w:pPr>
-              <w:spacing w:before="0" w:after="0" w:line="276" w:lineRule="auto"/>
-            </w:pPr>
-            <w:r>
-              <w:rPr>
-                <w:rFonts w:ascii="Calibri" w:hAnsi="Calibri"/>
-                <w:b/>
-                <w:color w:val="1A202C"/>
-                <w:sz w:val="17"/>
-              </w:rPr>
-              <w:t>25%</w:t>
-            </w:r>
-          </w:p>
-        </w:tc>
-        <w:tc>
-          <w:tcPr>
-            <w:tcW w:type="dxa" w:w="3120"/>
-            <w:shd w:fill="F7FAFC"/>
-            <w:tcMar>
-              <w:top w:w="60" w:type="dxa"/>
-              <w:bottom w:w="60" w:type="dxa"/>
-              <w:left w:w="70" w:type="dxa"/>
-              <w:right w:w="70" w:type="dxa"/>
-            </w:tcMar>
-          </w:tcPr>
-          <w:p>
-            <w:pPr>
-              <w:spacing w:before="0" w:after="0" w:line="276" w:lineRule="auto"/>
-            </w:pPr>
-            <w:r>
-              <w:rPr>
-                <w:rFonts w:ascii="Calibri" w:hAnsi="Calibri"/>
-                <w:color w:val="1A202C"/>
-                <w:sz w:val="17"/>
-              </w:rPr>
-              <w:t>Simulación de sala de crisis: contención de intrusión, preservación y sustentación oral</w:t>
-            </w:r>
-          </w:p>
-        </w:tc>
-      </w:tr>
-      <w:tr>
-        <w:tc>
-          <w:tcPr>
-            <w:tcW w:type="dxa" w:w="3120"/>
-            <w:tcMar>
-              <w:top w:w="60" w:type="dxa"/>
-              <w:bottom w:w="60" w:type="dxa"/>
-              <w:left w:w="70" w:type="dxa"/>
-              <w:right w:w="70" w:type="dxa"/>
-            </w:tcMar>
-          </w:tcPr>
-          <w:p>
-            <w:pPr>
-              <w:spacing w:before="0" w:after="0" w:line="276" w:lineRule="auto"/>
-            </w:pPr>
-            <w:r>
-              <w:rPr>
-                <w:rFonts w:ascii="Calibri" w:hAnsi="Calibri"/>
-                <w:b/>
-                <w:color w:val="1A202C"/>
-                <w:sz w:val="17"/>
-              </w:rPr>
-              <w:t>Bitácora Berichtsheft y Ética Kinal</w:t>
-            </w:r>
-          </w:p>
-        </w:tc>
-        <w:tc>
-          <w:tcPr>
-            <w:tcW w:type="dxa" w:w="3120"/>
-            <w:tcMar>
-              <w:top w:w="60" w:type="dxa"/>
-              <w:bottom w:w="60" w:type="dxa"/>
-              <w:left w:w="70" w:type="dxa"/>
-              <w:right w:w="70" w:type="dxa"/>
-            </w:tcMar>
-          </w:tcPr>
-          <w:p>
-            <w:pPr>
-              <w:spacing w:before="0" w:after="0" w:line="276" w:lineRule="auto"/>
-            </w:pPr>
-            <w:r>
-              <w:rPr>
-                <w:rFonts w:ascii="Calibri" w:hAnsi="Calibri"/>
-                <w:b/>
-                <w:color w:val="1A202C"/>
-                <w:sz w:val="17"/>
-              </w:rPr>
-              <w:t>15%</w:t>
-            </w:r>
-          </w:p>
-        </w:tc>
-        <w:tc>
-          <w:tcPr>
-            <w:tcW w:type="dxa" w:w="3120"/>
-            <w:tcMar>
-              <w:top w:w="60" w:type="dxa"/>
-              <w:bottom w:w="60" w:type="dxa"/>
-              <w:left w:w="70" w:type="dxa"/>
-              <w:right w:w="70" w:type="dxa"/>
-            </w:tcMar>
-          </w:tcPr>
-          <w:p>
-            <w:pPr>
-              <w:spacing w:before="0" w:after="0" w:line="276" w:lineRule="auto"/>
-            </w:pPr>
-            <w:r>
-              <w:rPr>
-                <w:rFonts w:ascii="Calibri" w:hAnsi="Calibri"/>
-                <w:color w:val="1A202C"/>
-                <w:sz w:val="17"/>
-              </w:rPr>
-              <w:t>Entrega semanal de bitácora técnica, asistencia puntual y cumplimiento del NDA</w:t>
+              <w:t>Expediente de seguridad del caso transversal y sustentación oral final.</w:t>
             </w:r>
           </w:p>
         </w:tc>
@@ -3563,36 +2836,163 @@
     </w:tbl>
     <w:p>
       <w:pPr>
-        <w:keepNext/>
-        <w:spacing w:before="320" w:after="120"/>
+        <w:spacing w:before="160" w:after="80" w:line="276" w:lineRule="auto"/>
       </w:pPr>
       <w:r>
         <w:rPr>
           <w:rFonts w:ascii="Calibri" w:hAnsi="Calibri"/>
           <w:b/>
           <w:color w:val="003366"/>
-          <w:sz w:val="30"/>
+          <w:sz w:val="20"/>
         </w:rPr>
-        <w:t>8. Estrategia de Inserción Laboral y Articulación Institucional</w:t>
+        <w:t>Contenido del Expediente de Seguridad del Caso Transversal (Entregable Terminal):</w:t>
       </w:r>
     </w:p>
     <w:p>
       <w:pPr>
-        <w:spacing w:before="0" w:after="120" w:line="276" w:lineRule="auto"/>
+        <w:spacing w:before="20" w:after="40" w:line="276" w:lineRule="auto"/>
+        <w:ind w:left="288"/>
       </w:pPr>
+      <w:r>
+        <w:rPr>
+          <w:b/>
+          <w:color w:val="003366"/>
+        </w:rPr>
+        <w:t xml:space="preserve">• </w:t>
+      </w:r>
       <w:r>
         <w:rPr>
           <w:rFonts w:ascii="Calibri" w:hAnsi="Calibri"/>
           <w:color w:val="1A202C"/>
-          <w:sz w:val="20"/>
+          <w:sz w:val="19"/>
         </w:rPr>
-        <w:t>Para maximizar la inserción laboral de los estudiantes desempleados (18 a 45 años), el programa articula tres mecanismos directos:</w:t>
-        <w:br/>
-        <w:t>1. Bolsa de Empleo de Fundación Kinal: Vinculación directa de los egresados con empresas aliadas en el sector financiero, telecomunicaciones y empresas de seguridad gestionada (MSSP) que buscan analistas de monitoreo 24/7.</w:t>
-        <w:br/>
-        <w:t>2. Portafolio de Casos Prácticos (Write-ups): Cada alumno compila durante el curso una bitácora técnica demostrable en GitHub/LinkedIn con los reportes de incidentes resueltos, demostrando experiencia técnica real a los reclutadores.</w:t>
-        <w:br/>
-        <w:t>3. Simulación de Entrevistas Técnicas: Talleres de preparación para pruebas de contratación (preguntas técnicas sobre protocolos, comandos de Linux, lectura de logs y escenarios de contingencia bajo presión).</w:t>
+        <w:t>Alcance del sistema y clasificación de información; diagrama con componentes, datos y dependencias.</w:t>
+      </w:r>
+    </w:p>
+    <w:p>
+      <w:pPr>
+        <w:spacing w:before="20" w:after="40" w:line="276" w:lineRule="auto"/>
+        <w:ind w:left="288"/>
+      </w:pPr>
+      <w:r>
+        <w:rPr>
+          <w:b/>
+          <w:color w:val="003366"/>
+        </w:rPr>
+        <w:t xml:space="preserve">• </w:t>
+      </w:r>
+      <w:r>
+        <w:rPr>
+          <w:rFonts w:ascii="Calibri" w:hAnsi="Calibri"/>
+          <w:color w:val="1A202C"/>
+          <w:sz w:val="19"/>
+        </w:rPr>
+        <w:t>Flujo de autenticación y sesión; matriz de roles y permisos (RBAC); alta, cambio y baja de usuarios.</w:t>
+      </w:r>
+    </w:p>
+    <w:p>
+      <w:pPr>
+        <w:spacing w:before="20" w:after="40" w:line="276" w:lineRule="auto"/>
+        <w:ind w:left="288"/>
+      </w:pPr>
+      <w:r>
+        <w:rPr>
+          <w:b/>
+          <w:color w:val="003366"/>
+        </w:rPr>
+        <w:t xml:space="preserve">• </w:t>
+      </w:r>
+      <w:r>
+        <w:rPr>
+          <w:rFonts w:ascii="Calibri" w:hAnsi="Calibri"/>
+          <w:color w:val="1A202C"/>
+          <w:sz w:val="19"/>
+        </w:rPr>
+        <w:t>Asignación de responsabilidades y registro trazable de solicitud, aprobación, ejecución y cierre.</w:t>
+      </w:r>
+    </w:p>
+    <w:p>
+      <w:pPr>
+        <w:spacing w:before="20" w:after="40" w:line="276" w:lineRule="auto"/>
+        <w:ind w:left="288"/>
+      </w:pPr>
+      <w:r>
+        <w:rPr>
+          <w:b/>
+          <w:color w:val="003366"/>
+        </w:rPr>
+        <w:t xml:space="preserve">• </w:t>
+      </w:r>
+      <w:r>
+        <w:rPr>
+          <w:rFonts w:ascii="Calibri" w:hAnsi="Calibri"/>
+          <w:color w:val="1A202C"/>
+          <w:sz w:val="19"/>
+        </w:rPr>
+        <w:t>Recorrido web y ficha de certificados; controles básicos sobre una API.</w:t>
+      </w:r>
+    </w:p>
+    <w:p>
+      <w:pPr>
+        <w:spacing w:before="20" w:after="40" w:line="276" w:lineRule="auto"/>
+        <w:ind w:left="288"/>
+      </w:pPr>
+      <w:r>
+        <w:rPr>
+          <w:b/>
+          <w:color w:val="003366"/>
+        </w:rPr>
+        <w:t xml:space="preserve">• </w:t>
+      </w:r>
+      <w:r>
+        <w:rPr>
+          <w:rFonts w:ascii="Calibri" w:hAnsi="Calibri"/>
+          <w:color w:val="1A202C"/>
+          <w:sz w:val="19"/>
+        </w:rPr>
+        <w:t>Inventario con ciclo de vida; hallazgo de vulnerabilidad y plan de tratamiento con verificación.</w:t>
+      </w:r>
+    </w:p>
+    <w:p>
+      <w:pPr>
+        <w:spacing w:before="20" w:after="40" w:line="276" w:lineRule="auto"/>
+        <w:ind w:left="288"/>
+      </w:pPr>
+      <w:r>
+        <w:rPr>
+          <w:b/>
+          <w:color w:val="003366"/>
+        </w:rPr>
+        <w:t xml:space="preserve">• </w:t>
+      </w:r>
+      <w:r>
+        <w:rPr>
+          <w:rFonts w:ascii="Calibri" w:hAnsi="Calibri"/>
+          <w:color w:val="1A202C"/>
+          <w:sz w:val="19"/>
+        </w:rPr>
+        <w:t>Política de accesos y SOP de baja; evaluación de riesgo y solicitud de aceptación temporal.</w:t>
+      </w:r>
+    </w:p>
+    <w:p>
+      <w:pPr>
+        <w:spacing w:before="20" w:after="40" w:line="276" w:lineRule="auto"/>
+        <w:ind w:left="288"/>
+      </w:pPr>
+      <w:r>
+        <w:rPr>
+          <w:b/>
+          <w:color w:val="003366"/>
+        </w:rPr>
+        <w:t xml:space="preserve">• </w:t>
+      </w:r>
+      <w:r>
+        <w:rPr>
+          <w:rFonts w:ascii="Calibri" w:hAnsi="Calibri"/>
+          <w:color w:val="1A202C"/>
+          <w:sz w:val="19"/>
+        </w:rPr>
+        <w:t>Referencia de cumplimiento justificada y evidencia requerida; reporte formal de comunicación sospechosa.</w:t>
       </w:r>
     </w:p>
     <w:sectPr>
@@ -3618,9 +3018,9 @@
       <w:rPr>
         <w:rFonts w:ascii="Calibri" w:hAnsi="Calibri"/>
         <w:color w:val="4A5568"/>
-        <w:sz w:val="18"/>
-      </w:rPr>
-      <w:t>Fundación Kinal | Propuesta Formativa Oficial — Fundamentos de Ciberseguridad</w:t>
+        <w:sz w:val="17"/>
+      </w:rPr>
+      <w:t>Fundación Kinal | Ciberseguridad y Fundamentos de Seguridad de la Información — Propuesta Oficial</w:t>
     </w:r>
   </w:p>
 </w:ftr>

</xml_diff>